<commit_message>
Étudié en base de données
</commit_message>
<xml_diff>
--- a/BASE_DE_DONNEES_RELATIONNELLE/Cours13/Cours13_Revision.docx
+++ b/BASE_DE_DONNEES_RELATIONNELLE/Cours13/Cours13_Revision.docx
@@ -4,7 +4,7 @@
   <w:body>
     <w:p>
       <w:pPr>
-        <w:pStyle w:val="Heading1"/>
+        <w:pStyle w:val="Titre1"/>
         <w:spacing w:line="360" w:lineRule="auto"/>
         <w:rPr>
           <w:rFonts w:ascii="Calibri" w:hAnsi="Calibri" w:cs="Calibri"/>
@@ -31,7 +31,7 @@
     </w:p>
     <w:p>
       <w:pPr>
-        <w:pStyle w:val="Heading3"/>
+        <w:pStyle w:val="Titre3"/>
         <w:spacing w:line="360" w:lineRule="auto"/>
         <w:rPr>
           <w:rFonts w:ascii="Calibri" w:hAnsi="Calibri" w:cs="Calibri"/>
@@ -52,7 +52,7 @@
     </w:p>
     <w:p>
       <w:pPr>
-        <w:pStyle w:val="ListParagraph"/>
+        <w:pStyle w:val="Paragraphedeliste"/>
         <w:numPr>
           <w:ilvl w:val="0"/>
           <w:numId w:val="8"/>
@@ -94,7 +94,58 @@
     </w:p>
     <w:p>
       <w:pPr>
-        <w:pStyle w:val="ListParagraph"/>
+        <w:pStyle w:val="Paragraphedeliste"/>
+        <w:spacing w:line="360" w:lineRule="auto"/>
+        <w:rPr>
+          <w:rFonts w:ascii="Calibri" w:hAnsi="Calibri" w:cs="Calibri"/>
+          <w:lang w:val="fr-FR"/>
+        </w:rPr>
+      </w:pPr>
+      <w:r>
+        <w:rPr>
+          <w:rFonts w:ascii="Calibri" w:hAnsi="Calibri" w:cs="Calibri"/>
+          <w:lang w:val="fr-FR"/>
+        </w:rPr>
+        <w:drawing>
+          <wp:inline distT="0" distB="0" distL="0" distR="0" wp14:anchorId="0ACD7A15" wp14:editId="07D1378C">
+            <wp:extent cx="5687219" cy="704948"/>
+            <wp:effectExtent l="0" t="0" r="8890" b="0"/>
+            <wp:docPr id="169720807" name="Image 1"/>
+            <wp:cNvGraphicFramePr>
+              <a:graphicFrameLocks xmlns:a="http://schemas.openxmlformats.org/drawingml/2006/main" noChangeAspect="1"/>
+            </wp:cNvGraphicFramePr>
+            <a:graphic xmlns:a="http://schemas.openxmlformats.org/drawingml/2006/main">
+              <a:graphicData uri="http://schemas.openxmlformats.org/drawingml/2006/picture">
+                <pic:pic xmlns:pic="http://schemas.openxmlformats.org/drawingml/2006/picture">
+                  <pic:nvPicPr>
+                    <pic:cNvPr id="169720807" name=""/>
+                    <pic:cNvPicPr/>
+                  </pic:nvPicPr>
+                  <pic:blipFill>
+                    <a:blip r:embed="rId8"/>
+                    <a:stretch>
+                      <a:fillRect/>
+                    </a:stretch>
+                  </pic:blipFill>
+                  <pic:spPr>
+                    <a:xfrm>
+                      <a:off x="0" y="0"/>
+                      <a:ext cx="5687219" cy="704948"/>
+                    </a:xfrm>
+                    <a:prstGeom prst="rect">
+                      <a:avLst/>
+                    </a:prstGeom>
+                  </pic:spPr>
+                </pic:pic>
+              </a:graphicData>
+            </a:graphic>
+          </wp:inline>
+        </w:drawing>
+      </w:r>
+    </w:p>
+    <w:p>
+      <w:pPr>
+        <w:pStyle w:val="Paragraphedeliste"/>
         <w:numPr>
           <w:ilvl w:val="0"/>
           <w:numId w:val="8"/>
@@ -129,7 +180,58 @@
     </w:p>
     <w:p>
       <w:pPr>
-        <w:pStyle w:val="ListParagraph"/>
+        <w:pStyle w:val="Paragraphedeliste"/>
+        <w:spacing w:line="360" w:lineRule="auto"/>
+        <w:rPr>
+          <w:rFonts w:ascii="Calibri" w:hAnsi="Calibri" w:cs="Calibri"/>
+          <w:lang w:val="fr-FR"/>
+        </w:rPr>
+      </w:pPr>
+      <w:r>
+        <w:rPr>
+          <w:rFonts w:ascii="Calibri" w:hAnsi="Calibri" w:cs="Calibri"/>
+          <w:lang w:val="fr-FR"/>
+        </w:rPr>
+        <w:drawing>
+          <wp:inline distT="0" distB="0" distL="0" distR="0" wp14:anchorId="4563923F" wp14:editId="17EE5E8B">
+            <wp:extent cx="5811061" cy="1086002"/>
+            <wp:effectExtent l="0" t="0" r="0" b="0"/>
+            <wp:docPr id="1832528519" name="Image 1"/>
+            <wp:cNvGraphicFramePr>
+              <a:graphicFrameLocks xmlns:a="http://schemas.openxmlformats.org/drawingml/2006/main" noChangeAspect="1"/>
+            </wp:cNvGraphicFramePr>
+            <a:graphic xmlns:a="http://schemas.openxmlformats.org/drawingml/2006/main">
+              <a:graphicData uri="http://schemas.openxmlformats.org/drawingml/2006/picture">
+                <pic:pic xmlns:pic="http://schemas.openxmlformats.org/drawingml/2006/picture">
+                  <pic:nvPicPr>
+                    <pic:cNvPr id="1832528519" name=""/>
+                    <pic:cNvPicPr/>
+                  </pic:nvPicPr>
+                  <pic:blipFill>
+                    <a:blip r:embed="rId9"/>
+                    <a:stretch>
+                      <a:fillRect/>
+                    </a:stretch>
+                  </pic:blipFill>
+                  <pic:spPr>
+                    <a:xfrm>
+                      <a:off x="0" y="0"/>
+                      <a:ext cx="5811061" cy="1086002"/>
+                    </a:xfrm>
+                    <a:prstGeom prst="rect">
+                      <a:avLst/>
+                    </a:prstGeom>
+                  </pic:spPr>
+                </pic:pic>
+              </a:graphicData>
+            </a:graphic>
+          </wp:inline>
+        </w:drawing>
+      </w:r>
+    </w:p>
+    <w:p>
+      <w:pPr>
+        <w:pStyle w:val="Paragraphedeliste"/>
         <w:numPr>
           <w:ilvl w:val="0"/>
           <w:numId w:val="8"/>
@@ -150,7 +252,58 @@
     </w:p>
     <w:p>
       <w:pPr>
-        <w:pStyle w:val="ListParagraph"/>
+        <w:pStyle w:val="Paragraphedeliste"/>
+        <w:spacing w:line="360" w:lineRule="auto"/>
+        <w:rPr>
+          <w:rFonts w:ascii="Calibri" w:hAnsi="Calibri" w:cs="Calibri"/>
+          <w:lang w:val="fr-FR"/>
+        </w:rPr>
+      </w:pPr>
+      <w:r>
+        <w:rPr>
+          <w:rFonts w:ascii="Calibri" w:hAnsi="Calibri" w:cs="Calibri"/>
+          <w:lang w:val="fr-FR"/>
+        </w:rPr>
+        <w:drawing>
+          <wp:inline distT="0" distB="0" distL="0" distR="0" wp14:anchorId="0AFB8310" wp14:editId="6DDFC411">
+            <wp:extent cx="5744377" cy="914528"/>
+            <wp:effectExtent l="0" t="0" r="0" b="0"/>
+            <wp:docPr id="349237373" name="Image 1"/>
+            <wp:cNvGraphicFramePr>
+              <a:graphicFrameLocks xmlns:a="http://schemas.openxmlformats.org/drawingml/2006/main" noChangeAspect="1"/>
+            </wp:cNvGraphicFramePr>
+            <a:graphic xmlns:a="http://schemas.openxmlformats.org/drawingml/2006/main">
+              <a:graphicData uri="http://schemas.openxmlformats.org/drawingml/2006/picture">
+                <pic:pic xmlns:pic="http://schemas.openxmlformats.org/drawingml/2006/picture">
+                  <pic:nvPicPr>
+                    <pic:cNvPr id="349237373" name=""/>
+                    <pic:cNvPicPr/>
+                  </pic:nvPicPr>
+                  <pic:blipFill>
+                    <a:blip r:embed="rId10"/>
+                    <a:stretch>
+                      <a:fillRect/>
+                    </a:stretch>
+                  </pic:blipFill>
+                  <pic:spPr>
+                    <a:xfrm>
+                      <a:off x="0" y="0"/>
+                      <a:ext cx="5744377" cy="914528"/>
+                    </a:xfrm>
+                    <a:prstGeom prst="rect">
+                      <a:avLst/>
+                    </a:prstGeom>
+                  </pic:spPr>
+                </pic:pic>
+              </a:graphicData>
+            </a:graphic>
+          </wp:inline>
+        </w:drawing>
+      </w:r>
+    </w:p>
+    <w:p>
+      <w:pPr>
+        <w:pStyle w:val="Paragraphedeliste"/>
         <w:numPr>
           <w:ilvl w:val="0"/>
           <w:numId w:val="8"/>
@@ -185,7 +338,58 @@
     </w:p>
     <w:p>
       <w:pPr>
-        <w:pStyle w:val="ListParagraph"/>
+        <w:pStyle w:val="Paragraphedeliste"/>
+        <w:spacing w:line="360" w:lineRule="auto"/>
+        <w:rPr>
+          <w:rFonts w:ascii="Calibri" w:hAnsi="Calibri" w:cs="Calibri"/>
+          <w:lang w:val="fr-FR"/>
+        </w:rPr>
+      </w:pPr>
+      <w:r>
+        <w:rPr>
+          <w:rFonts w:ascii="Calibri" w:hAnsi="Calibri" w:cs="Calibri"/>
+          <w:lang w:val="fr-FR"/>
+        </w:rPr>
+        <w:drawing>
+          <wp:inline distT="0" distB="0" distL="0" distR="0" wp14:anchorId="5E29E295" wp14:editId="07E644C0">
+            <wp:extent cx="5144218" cy="914528"/>
+            <wp:effectExtent l="0" t="0" r="0" b="0"/>
+            <wp:docPr id="836506042" name="Image 1"/>
+            <wp:cNvGraphicFramePr>
+              <a:graphicFrameLocks xmlns:a="http://schemas.openxmlformats.org/drawingml/2006/main" noChangeAspect="1"/>
+            </wp:cNvGraphicFramePr>
+            <a:graphic xmlns:a="http://schemas.openxmlformats.org/drawingml/2006/main">
+              <a:graphicData uri="http://schemas.openxmlformats.org/drawingml/2006/picture">
+                <pic:pic xmlns:pic="http://schemas.openxmlformats.org/drawingml/2006/picture">
+                  <pic:nvPicPr>
+                    <pic:cNvPr id="836506042" name=""/>
+                    <pic:cNvPicPr/>
+                  </pic:nvPicPr>
+                  <pic:blipFill>
+                    <a:blip r:embed="rId11"/>
+                    <a:stretch>
+                      <a:fillRect/>
+                    </a:stretch>
+                  </pic:blipFill>
+                  <pic:spPr>
+                    <a:xfrm>
+                      <a:off x="0" y="0"/>
+                      <a:ext cx="5144218" cy="914528"/>
+                    </a:xfrm>
+                    <a:prstGeom prst="rect">
+                      <a:avLst/>
+                    </a:prstGeom>
+                  </pic:spPr>
+                </pic:pic>
+              </a:graphicData>
+            </a:graphic>
+          </wp:inline>
+        </w:drawing>
+      </w:r>
+    </w:p>
+    <w:p>
+      <w:pPr>
+        <w:pStyle w:val="Paragraphedeliste"/>
         <w:numPr>
           <w:ilvl w:val="0"/>
           <w:numId w:val="8"/>
@@ -241,7 +445,59 @@
     </w:p>
     <w:p>
       <w:pPr>
-        <w:pStyle w:val="ListParagraph"/>
+        <w:pStyle w:val="Paragraphedeliste"/>
+        <w:spacing w:line="360" w:lineRule="auto"/>
+        <w:rPr>
+          <w:rFonts w:ascii="Calibri" w:hAnsi="Calibri" w:cs="Calibri"/>
+          <w:lang w:val="fr-FR"/>
+        </w:rPr>
+      </w:pPr>
+      <w:r>
+        <w:rPr>
+          <w:rFonts w:ascii="Calibri" w:hAnsi="Calibri" w:cs="Calibri"/>
+          <w:lang w:val="fr-FR"/>
+        </w:rPr>
+        <w:lastRenderedPageBreak/>
+        <w:drawing>
+          <wp:inline distT="0" distB="0" distL="0" distR="0" wp14:anchorId="5114C801" wp14:editId="33C1F659">
+            <wp:extent cx="5943600" cy="1162050"/>
+            <wp:effectExtent l="0" t="0" r="0" b="0"/>
+            <wp:docPr id="1744239155" name="Image 1"/>
+            <wp:cNvGraphicFramePr>
+              <a:graphicFrameLocks xmlns:a="http://schemas.openxmlformats.org/drawingml/2006/main" noChangeAspect="1"/>
+            </wp:cNvGraphicFramePr>
+            <a:graphic xmlns:a="http://schemas.openxmlformats.org/drawingml/2006/main">
+              <a:graphicData uri="http://schemas.openxmlformats.org/drawingml/2006/picture">
+                <pic:pic xmlns:pic="http://schemas.openxmlformats.org/drawingml/2006/picture">
+                  <pic:nvPicPr>
+                    <pic:cNvPr id="1744239155" name=""/>
+                    <pic:cNvPicPr/>
+                  </pic:nvPicPr>
+                  <pic:blipFill>
+                    <a:blip r:embed="rId12"/>
+                    <a:stretch>
+                      <a:fillRect/>
+                    </a:stretch>
+                  </pic:blipFill>
+                  <pic:spPr>
+                    <a:xfrm>
+                      <a:off x="0" y="0"/>
+                      <a:ext cx="5943600" cy="1162050"/>
+                    </a:xfrm>
+                    <a:prstGeom prst="rect">
+                      <a:avLst/>
+                    </a:prstGeom>
+                  </pic:spPr>
+                </pic:pic>
+              </a:graphicData>
+            </a:graphic>
+          </wp:inline>
+        </w:drawing>
+      </w:r>
+    </w:p>
+    <w:p>
+      <w:pPr>
+        <w:pStyle w:val="Paragraphedeliste"/>
         <w:numPr>
           <w:ilvl w:val="0"/>
           <w:numId w:val="8"/>
@@ -276,7 +532,58 @@
     </w:p>
     <w:p>
       <w:pPr>
-        <w:pStyle w:val="ListParagraph"/>
+        <w:pStyle w:val="Paragraphedeliste"/>
+        <w:spacing w:line="360" w:lineRule="auto"/>
+        <w:rPr>
+          <w:rFonts w:ascii="Calibri" w:hAnsi="Calibri" w:cs="Calibri"/>
+          <w:lang w:val="fr-FR"/>
+        </w:rPr>
+      </w:pPr>
+      <w:r>
+        <w:rPr>
+          <w:rFonts w:ascii="Calibri" w:hAnsi="Calibri" w:cs="Calibri"/>
+          <w:lang w:val="fr-FR"/>
+        </w:rPr>
+        <w:drawing>
+          <wp:inline distT="0" distB="0" distL="0" distR="0" wp14:anchorId="01A79992" wp14:editId="10BE5A48">
+            <wp:extent cx="5943600" cy="1076960"/>
+            <wp:effectExtent l="0" t="0" r="0" b="8890"/>
+            <wp:docPr id="380430982" name="Image 1"/>
+            <wp:cNvGraphicFramePr>
+              <a:graphicFrameLocks xmlns:a="http://schemas.openxmlformats.org/drawingml/2006/main" noChangeAspect="1"/>
+            </wp:cNvGraphicFramePr>
+            <a:graphic xmlns:a="http://schemas.openxmlformats.org/drawingml/2006/main">
+              <a:graphicData uri="http://schemas.openxmlformats.org/drawingml/2006/picture">
+                <pic:pic xmlns:pic="http://schemas.openxmlformats.org/drawingml/2006/picture">
+                  <pic:nvPicPr>
+                    <pic:cNvPr id="380430982" name=""/>
+                    <pic:cNvPicPr/>
+                  </pic:nvPicPr>
+                  <pic:blipFill>
+                    <a:blip r:embed="rId13"/>
+                    <a:stretch>
+                      <a:fillRect/>
+                    </a:stretch>
+                  </pic:blipFill>
+                  <pic:spPr>
+                    <a:xfrm>
+                      <a:off x="0" y="0"/>
+                      <a:ext cx="5943600" cy="1076960"/>
+                    </a:xfrm>
+                    <a:prstGeom prst="rect">
+                      <a:avLst/>
+                    </a:prstGeom>
+                  </pic:spPr>
+                </pic:pic>
+              </a:graphicData>
+            </a:graphic>
+          </wp:inline>
+        </w:drawing>
+      </w:r>
+    </w:p>
+    <w:p>
+      <w:pPr>
+        <w:pStyle w:val="Paragraphedeliste"/>
         <w:numPr>
           <w:ilvl w:val="0"/>
           <w:numId w:val="8"/>
@@ -325,7 +632,58 @@
     </w:p>
     <w:p>
       <w:pPr>
-        <w:pStyle w:val="ListParagraph"/>
+        <w:pStyle w:val="Paragraphedeliste"/>
+        <w:spacing w:line="360" w:lineRule="auto"/>
+        <w:rPr>
+          <w:rFonts w:ascii="Calibri" w:hAnsi="Calibri" w:cs="Calibri"/>
+          <w:lang w:val="fr-FR"/>
+        </w:rPr>
+      </w:pPr>
+      <w:r>
+        <w:rPr>
+          <w:rFonts w:ascii="Calibri" w:hAnsi="Calibri" w:cs="Calibri"/>
+          <w:lang w:val="fr-FR"/>
+        </w:rPr>
+        <w:drawing>
+          <wp:inline distT="0" distB="0" distL="0" distR="0" wp14:anchorId="08CCCC1E" wp14:editId="59CB2BA3">
+            <wp:extent cx="5943600" cy="600075"/>
+            <wp:effectExtent l="0" t="0" r="0" b="9525"/>
+            <wp:docPr id="158335637" name="Image 1"/>
+            <wp:cNvGraphicFramePr>
+              <a:graphicFrameLocks xmlns:a="http://schemas.openxmlformats.org/drawingml/2006/main" noChangeAspect="1"/>
+            </wp:cNvGraphicFramePr>
+            <a:graphic xmlns:a="http://schemas.openxmlformats.org/drawingml/2006/main">
+              <a:graphicData uri="http://schemas.openxmlformats.org/drawingml/2006/picture">
+                <pic:pic xmlns:pic="http://schemas.openxmlformats.org/drawingml/2006/picture">
+                  <pic:nvPicPr>
+                    <pic:cNvPr id="158335637" name=""/>
+                    <pic:cNvPicPr/>
+                  </pic:nvPicPr>
+                  <pic:blipFill>
+                    <a:blip r:embed="rId14"/>
+                    <a:stretch>
+                      <a:fillRect/>
+                    </a:stretch>
+                  </pic:blipFill>
+                  <pic:spPr>
+                    <a:xfrm>
+                      <a:off x="0" y="0"/>
+                      <a:ext cx="5943600" cy="600075"/>
+                    </a:xfrm>
+                    <a:prstGeom prst="rect">
+                      <a:avLst/>
+                    </a:prstGeom>
+                  </pic:spPr>
+                </pic:pic>
+              </a:graphicData>
+            </a:graphic>
+          </wp:inline>
+        </w:drawing>
+      </w:r>
+    </w:p>
+    <w:p>
+      <w:pPr>
+        <w:pStyle w:val="Paragraphedeliste"/>
         <w:numPr>
           <w:ilvl w:val="0"/>
           <w:numId w:val="8"/>
@@ -360,6 +718,7 @@
       <w:r>
         <w:rPr>
           <w:rFonts w:ascii="Calibri" w:hAnsi="Calibri" w:cs="Calibri"/>
+          <w:noProof/>
           <w:lang w:val="fr-FR"/>
         </w:rPr>
         <w:drawing>
@@ -378,7 +737,7 @@
                     <pic:cNvPicPr/>
                   </pic:nvPicPr>
                   <pic:blipFill>
-                    <a:blip r:embed="rId5"/>
+                    <a:blip r:embed="rId15"/>
                     <a:stretch>
                       <a:fillRect/>
                     </a:stretch>
@@ -401,7 +760,7 @@
     </w:p>
     <w:p>
       <w:pPr>
-        <w:pStyle w:val="ListParagraph"/>
+        <w:pStyle w:val="Paragraphedeliste"/>
         <w:numPr>
           <w:ilvl w:val="0"/>
           <w:numId w:val="8"/>
@@ -443,7 +802,58 @@
     </w:p>
     <w:p>
       <w:pPr>
-        <w:pStyle w:val="ListParagraph"/>
+        <w:pStyle w:val="Paragraphedeliste"/>
+        <w:spacing w:line="360" w:lineRule="auto"/>
+        <w:rPr>
+          <w:rFonts w:ascii="Calibri" w:hAnsi="Calibri" w:cs="Calibri"/>
+          <w:lang w:val="fr-FR"/>
+        </w:rPr>
+      </w:pPr>
+      <w:r>
+        <w:rPr>
+          <w:rFonts w:ascii="Calibri" w:hAnsi="Calibri" w:cs="Calibri"/>
+          <w:lang w:val="fr-FR"/>
+        </w:rPr>
+        <w:drawing>
+          <wp:inline distT="0" distB="0" distL="0" distR="0" wp14:anchorId="0216E40F" wp14:editId="4528E8FA">
+            <wp:extent cx="5943600" cy="912495"/>
+            <wp:effectExtent l="0" t="0" r="0" b="1905"/>
+            <wp:docPr id="757837122" name="Image 1"/>
+            <wp:cNvGraphicFramePr>
+              <a:graphicFrameLocks xmlns:a="http://schemas.openxmlformats.org/drawingml/2006/main" noChangeAspect="1"/>
+            </wp:cNvGraphicFramePr>
+            <a:graphic xmlns:a="http://schemas.openxmlformats.org/drawingml/2006/main">
+              <a:graphicData uri="http://schemas.openxmlformats.org/drawingml/2006/picture">
+                <pic:pic xmlns:pic="http://schemas.openxmlformats.org/drawingml/2006/picture">
+                  <pic:nvPicPr>
+                    <pic:cNvPr id="757837122" name=""/>
+                    <pic:cNvPicPr/>
+                  </pic:nvPicPr>
+                  <pic:blipFill>
+                    <a:blip r:embed="rId16"/>
+                    <a:stretch>
+                      <a:fillRect/>
+                    </a:stretch>
+                  </pic:blipFill>
+                  <pic:spPr>
+                    <a:xfrm>
+                      <a:off x="0" y="0"/>
+                      <a:ext cx="5943600" cy="912495"/>
+                    </a:xfrm>
+                    <a:prstGeom prst="rect">
+                      <a:avLst/>
+                    </a:prstGeom>
+                  </pic:spPr>
+                </pic:pic>
+              </a:graphicData>
+            </a:graphic>
+          </wp:inline>
+        </w:drawing>
+      </w:r>
+    </w:p>
+    <w:p>
+      <w:pPr>
+        <w:pStyle w:val="Paragraphedeliste"/>
         <w:numPr>
           <w:ilvl w:val="0"/>
           <w:numId w:val="8"/>
@@ -493,7 +903,7 @@
     </w:p>
     <w:p>
       <w:pPr>
-        <w:pStyle w:val="ListParagraph"/>
+        <w:pStyle w:val="Paragraphedeliste"/>
         <w:numPr>
           <w:ilvl w:val="0"/>
           <w:numId w:val="8"/>
@@ -578,6 +988,7 @@
       <w:r>
         <w:rPr>
           <w:rFonts w:ascii="Calibri" w:hAnsi="Calibri" w:cs="Calibri"/>
+          <w:noProof/>
           <w:lang w:val="fr-FR"/>
         </w:rPr>
         <w:drawing>
@@ -596,7 +1007,7 @@
                     <pic:cNvPicPr/>
                   </pic:nvPicPr>
                   <pic:blipFill>
-                    <a:blip r:embed="rId6"/>
+                    <a:blip r:embed="rId17"/>
                     <a:stretch>
                       <a:fillRect/>
                     </a:stretch>
@@ -619,7 +1030,7 @@
     </w:p>
     <w:p>
       <w:pPr>
-        <w:pStyle w:val="ListParagraph"/>
+        <w:pStyle w:val="Paragraphedeliste"/>
         <w:numPr>
           <w:ilvl w:val="0"/>
           <w:numId w:val="8"/>
@@ -675,7 +1086,7 @@
     </w:p>
     <w:p>
       <w:pPr>
-        <w:pStyle w:val="ListParagraph"/>
+        <w:pStyle w:val="Paragraphedeliste"/>
         <w:numPr>
           <w:ilvl w:val="0"/>
           <w:numId w:val="8"/>
@@ -696,7 +1107,7 @@
     </w:p>
     <w:p>
       <w:pPr>
-        <w:pStyle w:val="ListParagraph"/>
+        <w:pStyle w:val="Paragraphedeliste"/>
         <w:numPr>
           <w:ilvl w:val="0"/>
           <w:numId w:val="8"/>
@@ -745,7 +1156,7 @@
     </w:p>
     <w:p>
       <w:pPr>
-        <w:pStyle w:val="ListParagraph"/>
+        <w:pStyle w:val="Paragraphedeliste"/>
         <w:numPr>
           <w:ilvl w:val="0"/>
           <w:numId w:val="8"/>
@@ -794,7 +1205,7 @@
     </w:p>
     <w:p>
       <w:pPr>
-        <w:pStyle w:val="ListParagraph"/>
+        <w:pStyle w:val="Paragraphedeliste"/>
         <w:spacing w:line="360" w:lineRule="auto"/>
         <w:rPr>
           <w:rFonts w:ascii="Calibri" w:hAnsi="Calibri" w:cs="Calibri"/>
@@ -804,6 +1215,7 @@
       <w:r>
         <w:rPr>
           <w:rFonts w:ascii="Calibri" w:hAnsi="Calibri" w:cs="Calibri"/>
+          <w:noProof/>
           <w:lang w:val="en-CA"/>
         </w:rPr>
         <w:drawing>
@@ -822,7 +1234,7 @@
                     <pic:cNvPicPr/>
                   </pic:nvPicPr>
                   <pic:blipFill>
-                    <a:blip r:embed="rId7"/>
+                    <a:blip r:embed="rId18"/>
                     <a:stretch>
                       <a:fillRect/>
                     </a:stretch>
@@ -2082,11 +2494,11 @@
       <w:lang w:val="fr-CA"/>
     </w:rPr>
   </w:style>
-  <w:style w:type="paragraph" w:styleId="Heading1">
+  <w:style w:type="paragraph" w:styleId="Titre1">
     <w:name w:val="heading 1"/>
     <w:basedOn w:val="Normal"/>
     <w:next w:val="Normal"/>
-    <w:link w:val="Heading1Char"/>
+    <w:link w:val="Titre1Car"/>
     <w:uiPriority w:val="9"/>
     <w:qFormat/>
     <w:rsid w:val="00A9640A"/>
@@ -2103,11 +2515,11 @@
       <w:szCs w:val="40"/>
     </w:rPr>
   </w:style>
-  <w:style w:type="paragraph" w:styleId="Heading2">
+  <w:style w:type="paragraph" w:styleId="Titre2">
     <w:name w:val="heading 2"/>
     <w:basedOn w:val="Normal"/>
     <w:next w:val="Normal"/>
-    <w:link w:val="Heading2Char"/>
+    <w:link w:val="Titre2Car"/>
     <w:uiPriority w:val="9"/>
     <w:unhideWhenUsed/>
     <w:qFormat/>
@@ -2125,11 +2537,11 @@
       <w:szCs w:val="32"/>
     </w:rPr>
   </w:style>
-  <w:style w:type="paragraph" w:styleId="Heading3">
+  <w:style w:type="paragraph" w:styleId="Titre3">
     <w:name w:val="heading 3"/>
     <w:basedOn w:val="Normal"/>
     <w:next w:val="Normal"/>
-    <w:link w:val="Heading3Char"/>
+    <w:link w:val="Titre3Car"/>
     <w:uiPriority w:val="9"/>
     <w:unhideWhenUsed/>
     <w:qFormat/>
@@ -2147,11 +2559,11 @@
       <w:szCs w:val="28"/>
     </w:rPr>
   </w:style>
-  <w:style w:type="paragraph" w:styleId="Heading4">
+  <w:style w:type="paragraph" w:styleId="Titre4">
     <w:name w:val="heading 4"/>
     <w:basedOn w:val="Normal"/>
     <w:next w:val="Normal"/>
-    <w:link w:val="Heading4Char"/>
+    <w:link w:val="Titre4Car"/>
     <w:uiPriority w:val="9"/>
     <w:semiHidden/>
     <w:unhideWhenUsed/>
@@ -2170,11 +2582,11 @@
       <w:color w:val="0F4761" w:themeColor="accent1" w:themeShade="BF"/>
     </w:rPr>
   </w:style>
-  <w:style w:type="paragraph" w:styleId="Heading5">
+  <w:style w:type="paragraph" w:styleId="Titre5">
     <w:name w:val="heading 5"/>
     <w:basedOn w:val="Normal"/>
     <w:next w:val="Normal"/>
-    <w:link w:val="Heading5Char"/>
+    <w:link w:val="Titre5Car"/>
     <w:uiPriority w:val="9"/>
     <w:semiHidden/>
     <w:unhideWhenUsed/>
@@ -2191,11 +2603,11 @@
       <w:color w:val="0F4761" w:themeColor="accent1" w:themeShade="BF"/>
     </w:rPr>
   </w:style>
-  <w:style w:type="paragraph" w:styleId="Heading6">
+  <w:style w:type="paragraph" w:styleId="Titre6">
     <w:name w:val="heading 6"/>
     <w:basedOn w:val="Normal"/>
     <w:next w:val="Normal"/>
-    <w:link w:val="Heading6Char"/>
+    <w:link w:val="Titre6Car"/>
     <w:uiPriority w:val="9"/>
     <w:semiHidden/>
     <w:unhideWhenUsed/>
@@ -2214,11 +2626,11 @@
       <w:color w:val="595959" w:themeColor="text1" w:themeTint="A6"/>
     </w:rPr>
   </w:style>
-  <w:style w:type="paragraph" w:styleId="Heading7">
+  <w:style w:type="paragraph" w:styleId="Titre7">
     <w:name w:val="heading 7"/>
     <w:basedOn w:val="Normal"/>
     <w:next w:val="Normal"/>
-    <w:link w:val="Heading7Char"/>
+    <w:link w:val="Titre7Car"/>
     <w:uiPriority w:val="9"/>
     <w:semiHidden/>
     <w:unhideWhenUsed/>
@@ -2235,11 +2647,11 @@
       <w:color w:val="595959" w:themeColor="text1" w:themeTint="A6"/>
     </w:rPr>
   </w:style>
-  <w:style w:type="paragraph" w:styleId="Heading8">
+  <w:style w:type="paragraph" w:styleId="Titre8">
     <w:name w:val="heading 8"/>
     <w:basedOn w:val="Normal"/>
     <w:next w:val="Normal"/>
-    <w:link w:val="Heading8Char"/>
+    <w:link w:val="Titre8Car"/>
     <w:uiPriority w:val="9"/>
     <w:semiHidden/>
     <w:unhideWhenUsed/>
@@ -2258,11 +2670,11 @@
       <w:color w:val="272727" w:themeColor="text1" w:themeTint="D8"/>
     </w:rPr>
   </w:style>
-  <w:style w:type="paragraph" w:styleId="Heading9">
+  <w:style w:type="paragraph" w:styleId="Titre9">
     <w:name w:val="heading 9"/>
     <w:basedOn w:val="Normal"/>
     <w:next w:val="Normal"/>
-    <w:link w:val="Heading9Char"/>
+    <w:link w:val="Titre9Car"/>
     <w:uiPriority w:val="9"/>
     <w:semiHidden/>
     <w:unhideWhenUsed/>
@@ -2279,12 +2691,13 @@
       <w:color w:val="272727" w:themeColor="text1" w:themeTint="D8"/>
     </w:rPr>
   </w:style>
-  <w:style w:type="character" w:default="1" w:styleId="DefaultParagraphFont">
+  <w:style w:type="character" w:default="1" w:styleId="Policepardfaut">
     <w:name w:val="Default Paragraph Font"/>
     <w:uiPriority w:val="1"/>
+    <w:semiHidden/>
     <w:unhideWhenUsed/>
   </w:style>
-  <w:style w:type="table" w:default="1" w:styleId="TableNormal">
+  <w:style w:type="table" w:default="1" w:styleId="TableauNormal">
     <w:name w:val="Normal Table"/>
     <w:uiPriority w:val="99"/>
     <w:semiHidden/>
@@ -2299,16 +2712,16 @@
       </w:tblCellMar>
     </w:tblPr>
   </w:style>
-  <w:style w:type="numbering" w:default="1" w:styleId="NoList">
+  <w:style w:type="numbering" w:default="1" w:styleId="Aucuneliste">
     <w:name w:val="No List"/>
     <w:uiPriority w:val="99"/>
     <w:semiHidden/>
     <w:unhideWhenUsed/>
   </w:style>
-  <w:style w:type="character" w:customStyle="1" w:styleId="Heading1Char">
-    <w:name w:val="Heading 1 Char"/>
-    <w:basedOn w:val="DefaultParagraphFont"/>
-    <w:link w:val="Heading1"/>
+  <w:style w:type="character" w:customStyle="1" w:styleId="Titre1Car">
+    <w:name w:val="Titre 1 Car"/>
+    <w:basedOn w:val="Policepardfaut"/>
+    <w:link w:val="Titre1"/>
     <w:uiPriority w:val="9"/>
     <w:rsid w:val="00A9640A"/>
     <w:rPr>
@@ -2319,10 +2732,10 @@
       <w:lang w:val="fr-CA"/>
     </w:rPr>
   </w:style>
-  <w:style w:type="character" w:customStyle="1" w:styleId="Heading2Char">
-    <w:name w:val="Heading 2 Char"/>
-    <w:basedOn w:val="DefaultParagraphFont"/>
-    <w:link w:val="Heading2"/>
+  <w:style w:type="character" w:customStyle="1" w:styleId="Titre2Car">
+    <w:name w:val="Titre 2 Car"/>
+    <w:basedOn w:val="Policepardfaut"/>
+    <w:link w:val="Titre2"/>
     <w:uiPriority w:val="9"/>
     <w:rsid w:val="00A9640A"/>
     <w:rPr>
@@ -2333,10 +2746,10 @@
       <w:lang w:val="fr-CA"/>
     </w:rPr>
   </w:style>
-  <w:style w:type="character" w:customStyle="1" w:styleId="Heading3Char">
-    <w:name w:val="Heading 3 Char"/>
-    <w:basedOn w:val="DefaultParagraphFont"/>
-    <w:link w:val="Heading3"/>
+  <w:style w:type="character" w:customStyle="1" w:styleId="Titre3Car">
+    <w:name w:val="Titre 3 Car"/>
+    <w:basedOn w:val="Policepardfaut"/>
+    <w:link w:val="Titre3"/>
     <w:uiPriority w:val="9"/>
     <w:rsid w:val="00A9640A"/>
     <w:rPr>
@@ -2347,10 +2760,10 @@
       <w:lang w:val="fr-CA"/>
     </w:rPr>
   </w:style>
-  <w:style w:type="character" w:customStyle="1" w:styleId="Heading4Char">
-    <w:name w:val="Heading 4 Char"/>
-    <w:basedOn w:val="DefaultParagraphFont"/>
-    <w:link w:val="Heading4"/>
+  <w:style w:type="character" w:customStyle="1" w:styleId="Titre4Car">
+    <w:name w:val="Titre 4 Car"/>
+    <w:basedOn w:val="Policepardfaut"/>
+    <w:link w:val="Titre4"/>
     <w:uiPriority w:val="9"/>
     <w:semiHidden/>
     <w:rsid w:val="00A9640A"/>
@@ -2362,10 +2775,10 @@
       <w:lang w:val="fr-CA"/>
     </w:rPr>
   </w:style>
-  <w:style w:type="character" w:customStyle="1" w:styleId="Heading5Char">
-    <w:name w:val="Heading 5 Char"/>
-    <w:basedOn w:val="DefaultParagraphFont"/>
-    <w:link w:val="Heading5"/>
+  <w:style w:type="character" w:customStyle="1" w:styleId="Titre5Car">
+    <w:name w:val="Titre 5 Car"/>
+    <w:basedOn w:val="Policepardfaut"/>
+    <w:link w:val="Titre5"/>
     <w:uiPriority w:val="9"/>
     <w:semiHidden/>
     <w:rsid w:val="00A9640A"/>
@@ -2375,10 +2788,10 @@
       <w:lang w:val="fr-CA"/>
     </w:rPr>
   </w:style>
-  <w:style w:type="character" w:customStyle="1" w:styleId="Heading6Char">
-    <w:name w:val="Heading 6 Char"/>
-    <w:basedOn w:val="DefaultParagraphFont"/>
-    <w:link w:val="Heading6"/>
+  <w:style w:type="character" w:customStyle="1" w:styleId="Titre6Car">
+    <w:name w:val="Titre 6 Car"/>
+    <w:basedOn w:val="Policepardfaut"/>
+    <w:link w:val="Titre6"/>
     <w:uiPriority w:val="9"/>
     <w:semiHidden/>
     <w:rsid w:val="00A9640A"/>
@@ -2390,10 +2803,10 @@
       <w:lang w:val="fr-CA"/>
     </w:rPr>
   </w:style>
-  <w:style w:type="character" w:customStyle="1" w:styleId="Heading7Char">
-    <w:name w:val="Heading 7 Char"/>
-    <w:basedOn w:val="DefaultParagraphFont"/>
-    <w:link w:val="Heading7"/>
+  <w:style w:type="character" w:customStyle="1" w:styleId="Titre7Car">
+    <w:name w:val="Titre 7 Car"/>
+    <w:basedOn w:val="Policepardfaut"/>
+    <w:link w:val="Titre7"/>
     <w:uiPriority w:val="9"/>
     <w:semiHidden/>
     <w:rsid w:val="00A9640A"/>
@@ -2403,10 +2816,10 @@
       <w:lang w:val="fr-CA"/>
     </w:rPr>
   </w:style>
-  <w:style w:type="character" w:customStyle="1" w:styleId="Heading8Char">
-    <w:name w:val="Heading 8 Char"/>
-    <w:basedOn w:val="DefaultParagraphFont"/>
-    <w:link w:val="Heading8"/>
+  <w:style w:type="character" w:customStyle="1" w:styleId="Titre8Car">
+    <w:name w:val="Titre 8 Car"/>
+    <w:basedOn w:val="Policepardfaut"/>
+    <w:link w:val="Titre8"/>
     <w:uiPriority w:val="9"/>
     <w:semiHidden/>
     <w:rsid w:val="00A9640A"/>
@@ -2418,10 +2831,10 @@
       <w:lang w:val="fr-CA"/>
     </w:rPr>
   </w:style>
-  <w:style w:type="character" w:customStyle="1" w:styleId="Heading9Char">
-    <w:name w:val="Heading 9 Char"/>
-    <w:basedOn w:val="DefaultParagraphFont"/>
-    <w:link w:val="Heading9"/>
+  <w:style w:type="character" w:customStyle="1" w:styleId="Titre9Car">
+    <w:name w:val="Titre 9 Car"/>
+    <w:basedOn w:val="Policepardfaut"/>
+    <w:link w:val="Titre9"/>
     <w:uiPriority w:val="9"/>
     <w:semiHidden/>
     <w:rsid w:val="00A9640A"/>
@@ -2431,11 +2844,11 @@
       <w:lang w:val="fr-CA"/>
     </w:rPr>
   </w:style>
-  <w:style w:type="paragraph" w:styleId="Title">
+  <w:style w:type="paragraph" w:styleId="Titre">
     <w:name w:val="Title"/>
     <w:basedOn w:val="Normal"/>
     <w:next w:val="Normal"/>
-    <w:link w:val="TitleChar"/>
+    <w:link w:val="TitreCar"/>
     <w:uiPriority w:val="10"/>
     <w:qFormat/>
     <w:rsid w:val="00A9640A"/>
@@ -2451,10 +2864,10 @@
       <w:szCs w:val="56"/>
     </w:rPr>
   </w:style>
-  <w:style w:type="character" w:customStyle="1" w:styleId="TitleChar">
-    <w:name w:val="Title Char"/>
-    <w:basedOn w:val="DefaultParagraphFont"/>
-    <w:link w:val="Title"/>
+  <w:style w:type="character" w:customStyle="1" w:styleId="TitreCar">
+    <w:name w:val="Titre Car"/>
+    <w:basedOn w:val="Policepardfaut"/>
+    <w:link w:val="Titre"/>
     <w:uiPriority w:val="10"/>
     <w:rsid w:val="00A9640A"/>
     <w:rPr>
@@ -2466,11 +2879,11 @@
       <w:lang w:val="fr-CA"/>
     </w:rPr>
   </w:style>
-  <w:style w:type="paragraph" w:styleId="Subtitle">
+  <w:style w:type="paragraph" w:styleId="Sous-titre">
     <w:name w:val="Subtitle"/>
     <w:basedOn w:val="Normal"/>
     <w:next w:val="Normal"/>
-    <w:link w:val="SubtitleChar"/>
+    <w:link w:val="Sous-titreCar"/>
     <w:uiPriority w:val="11"/>
     <w:qFormat/>
     <w:rsid w:val="00A9640A"/>
@@ -2487,10 +2900,10 @@
       <w:szCs w:val="28"/>
     </w:rPr>
   </w:style>
-  <w:style w:type="character" w:customStyle="1" w:styleId="SubtitleChar">
-    <w:name w:val="Subtitle Char"/>
-    <w:basedOn w:val="DefaultParagraphFont"/>
-    <w:link w:val="Subtitle"/>
+  <w:style w:type="character" w:customStyle="1" w:styleId="Sous-titreCar">
+    <w:name w:val="Sous-titre Car"/>
+    <w:basedOn w:val="Policepardfaut"/>
+    <w:link w:val="Sous-titre"/>
     <w:uiPriority w:val="11"/>
     <w:rsid w:val="00A9640A"/>
     <w:rPr>
@@ -2502,11 +2915,11 @@
       <w:lang w:val="fr-CA"/>
     </w:rPr>
   </w:style>
-  <w:style w:type="paragraph" w:styleId="Quote">
+  <w:style w:type="paragraph" w:styleId="Citation">
     <w:name w:val="Quote"/>
     <w:basedOn w:val="Normal"/>
     <w:next w:val="Normal"/>
-    <w:link w:val="QuoteChar"/>
+    <w:link w:val="CitationCar"/>
     <w:uiPriority w:val="29"/>
     <w:qFormat/>
     <w:rsid w:val="00A9640A"/>
@@ -2520,10 +2933,10 @@
       <w:color w:val="404040" w:themeColor="text1" w:themeTint="BF"/>
     </w:rPr>
   </w:style>
-  <w:style w:type="character" w:customStyle="1" w:styleId="QuoteChar">
-    <w:name w:val="Quote Char"/>
-    <w:basedOn w:val="DefaultParagraphFont"/>
-    <w:link w:val="Quote"/>
+  <w:style w:type="character" w:customStyle="1" w:styleId="CitationCar">
+    <w:name w:val="Citation Car"/>
+    <w:basedOn w:val="Policepardfaut"/>
+    <w:link w:val="Citation"/>
     <w:uiPriority w:val="29"/>
     <w:rsid w:val="00A9640A"/>
     <w:rPr>
@@ -2533,7 +2946,7 @@
       <w:lang w:val="fr-CA"/>
     </w:rPr>
   </w:style>
-  <w:style w:type="paragraph" w:styleId="ListParagraph">
+  <w:style w:type="paragraph" w:styleId="Paragraphedeliste">
     <w:name w:val="List Paragraph"/>
     <w:basedOn w:val="Normal"/>
     <w:uiPriority w:val="34"/>
@@ -2544,9 +2957,9 @@
       <w:contextualSpacing/>
     </w:pPr>
   </w:style>
-  <w:style w:type="character" w:styleId="IntenseEmphasis">
+  <w:style w:type="character" w:styleId="Accentuationintense">
     <w:name w:val="Intense Emphasis"/>
-    <w:basedOn w:val="DefaultParagraphFont"/>
+    <w:basedOn w:val="Policepardfaut"/>
     <w:uiPriority w:val="21"/>
     <w:qFormat/>
     <w:rsid w:val="00A9640A"/>
@@ -2556,11 +2969,11 @@
       <w:color w:val="0F4761" w:themeColor="accent1" w:themeShade="BF"/>
     </w:rPr>
   </w:style>
-  <w:style w:type="paragraph" w:styleId="IntenseQuote">
+  <w:style w:type="paragraph" w:styleId="Citationintense">
     <w:name w:val="Intense Quote"/>
     <w:basedOn w:val="Normal"/>
     <w:next w:val="Normal"/>
-    <w:link w:val="IntenseQuoteChar"/>
+    <w:link w:val="CitationintenseCar"/>
     <w:uiPriority w:val="30"/>
     <w:qFormat/>
     <w:rsid w:val="00A9640A"/>
@@ -2579,10 +2992,10 @@
       <w:color w:val="0F4761" w:themeColor="accent1" w:themeShade="BF"/>
     </w:rPr>
   </w:style>
-  <w:style w:type="character" w:customStyle="1" w:styleId="IntenseQuoteChar">
-    <w:name w:val="Intense Quote Char"/>
-    <w:basedOn w:val="DefaultParagraphFont"/>
-    <w:link w:val="IntenseQuote"/>
+  <w:style w:type="character" w:customStyle="1" w:styleId="CitationintenseCar">
+    <w:name w:val="Citation intense Car"/>
+    <w:basedOn w:val="Policepardfaut"/>
+    <w:link w:val="Citationintense"/>
     <w:uiPriority w:val="30"/>
     <w:rsid w:val="00A9640A"/>
     <w:rPr>
@@ -2592,9 +3005,9 @@
       <w:lang w:val="fr-CA"/>
     </w:rPr>
   </w:style>
-  <w:style w:type="character" w:styleId="IntenseReference">
+  <w:style w:type="character" w:styleId="Rfrenceintense">
     <w:name w:val="Intense Reference"/>
-    <w:basedOn w:val="DefaultParagraphFont"/>
+    <w:basedOn w:val="Policepardfaut"/>
     <w:uiPriority w:val="32"/>
     <w:qFormat/>
     <w:rsid w:val="00A9640A"/>
@@ -2606,9 +3019,9 @@
       <w:spacing w:val="5"/>
     </w:rPr>
   </w:style>
-  <w:style w:type="character" w:styleId="Emphasis">
+  <w:style w:type="character" w:styleId="Accentuation">
     <w:name w:val="Emphasis"/>
-    <w:basedOn w:val="DefaultParagraphFont"/>
+    <w:basedOn w:val="Policepardfaut"/>
     <w:uiPriority w:val="20"/>
     <w:qFormat/>
     <w:rsid w:val="00E965CD"/>
@@ -2617,9 +3030,9 @@
       <w:iCs/>
     </w:rPr>
   </w:style>
-  <w:style w:type="character" w:styleId="Hyperlink">
+  <w:style w:type="character" w:styleId="Lienhypertexte">
     <w:name w:val="Hyperlink"/>
-    <w:basedOn w:val="DefaultParagraphFont"/>
+    <w:basedOn w:val="Policepardfaut"/>
     <w:uiPriority w:val="99"/>
     <w:unhideWhenUsed/>
     <w:rsid w:val="007155B2"/>
@@ -2628,9 +3041,9 @@
       <w:u w:val="single"/>
     </w:rPr>
   </w:style>
-  <w:style w:type="character" w:styleId="UnresolvedMention">
+  <w:style w:type="character" w:styleId="Mentionnonrsolue">
     <w:name w:val="Unresolved Mention"/>
-    <w:basedOn w:val="DefaultParagraphFont"/>
+    <w:basedOn w:val="Policepardfaut"/>
     <w:uiPriority w:val="99"/>
     <w:semiHidden/>
     <w:unhideWhenUsed/>
@@ -2959,6 +3372,15 @@
 </file>
 
 <file path=customXml/item1.xml><?xml version="1.0" encoding="utf-8"?>
+<?mso-contentType ?>
+<FormTemplates xmlns="http://schemas.microsoft.com/sharepoint/v3/contenttype/forms">
+  <Display>DocumentLibraryForm</Display>
+  <Edit>DocumentLibraryForm</Edit>
+  <New>DocumentLibraryForm</New>
+</FormTemplates>
+</file>
+
+<file path=customXml/item2.xml><?xml version="1.0" encoding="utf-8"?>
 <ct:contentTypeSchema xmlns:ct="http://schemas.microsoft.com/office/2006/metadata/contentType" xmlns:ma="http://schemas.microsoft.com/office/2006/metadata/properties/metaAttributes" ct:_="" ma:_="" ma:contentTypeName="Document" ma:contentTypeID="0x010100B537D9CBF3A81D42A7781564E1C4B118" ma:contentTypeVersion="3" ma:contentTypeDescription="Crée un document." ma:contentTypeScope="" ma:versionID="ad8e0ebe14b96894426a6ebf504a5a97">
   <xsd:schema xmlns:xsd="http://www.w3.org/2001/XMLSchema" xmlns:xs="http://www.w3.org/2001/XMLSchema" xmlns:p="http://schemas.microsoft.com/office/2006/metadata/properties" xmlns:ns2="1256c6ae-50a3-4b3f-a741-966f546b47e8" targetNamespace="http://schemas.microsoft.com/office/2006/metadata/properties" ma:root="true" ma:fieldsID="f1ecc96f702649f69a444d67ff7c73fa" ns2:_="">
     <xsd:import namespace="1256c6ae-50a3-4b3f-a741-966f546b47e8"/>
@@ -3096,15 +3518,6 @@
 </ct:contentTypeSchema>
 </file>
 
-<file path=customXml/item2.xml><?xml version="1.0" encoding="utf-8"?>
-<?mso-contentType ?>
-<FormTemplates xmlns="http://schemas.microsoft.com/sharepoint/v3/contenttype/forms">
-  <Display>DocumentLibraryForm</Display>
-  <Edit>DocumentLibraryForm</Edit>
-  <New>DocumentLibraryForm</New>
-</FormTemplates>
-</file>
-
 <file path=customXml/item3.xml><?xml version="1.0" encoding="utf-8"?>
 <p:properties xmlns:p="http://schemas.microsoft.com/office/2006/metadata/properties" xmlns:xsi="http://www.w3.org/2001/XMLSchema-instance" xmlns:pc="http://schemas.microsoft.com/office/infopath/2007/PartnerControls">
   <documentManagement/>
@@ -3112,13 +3525,36 @@
 </file>
 
 <file path=customXml/itemProps1.xml><?xml version="1.0" encoding="utf-8"?>
-<ds:datastoreItem xmlns:ds="http://schemas.openxmlformats.org/officeDocument/2006/customXml" ds:itemID="{584D6599-AA16-4EA9-BF36-A942F2A35E94}"/>
+<ds:datastoreItem xmlns:ds="http://schemas.openxmlformats.org/officeDocument/2006/customXml" ds:itemID="{C363C405-5F69-494A-9EC9-42981894C99C}">
+  <ds:schemaRefs>
+    <ds:schemaRef ds:uri="http://schemas.microsoft.com/sharepoint/v3/contenttype/forms"/>
+  </ds:schemaRefs>
+</ds:datastoreItem>
 </file>
 
 <file path=customXml/itemProps2.xml><?xml version="1.0" encoding="utf-8"?>
-<ds:datastoreItem xmlns:ds="http://schemas.openxmlformats.org/officeDocument/2006/customXml" ds:itemID="{C363C405-5F69-494A-9EC9-42981894C99C}"/>
+<ds:datastoreItem xmlns:ds="http://schemas.openxmlformats.org/officeDocument/2006/customXml" ds:itemID="{584D6599-AA16-4EA9-BF36-A942F2A35E94}">
+  <ds:schemaRefs>
+    <ds:schemaRef ds:uri="http://schemas.microsoft.com/office/2006/metadata/contentType"/>
+    <ds:schemaRef ds:uri="http://schemas.microsoft.com/office/2006/metadata/properties/metaAttributes"/>
+    <ds:schemaRef ds:uri="http://www.w3.org/2001/XMLSchema"/>
+    <ds:schemaRef ds:uri="http://schemas.microsoft.com/office/2006/metadata/properties"/>
+    <ds:schemaRef ds:uri="1256c6ae-50a3-4b3f-a741-966f546b47e8"/>
+    <ds:schemaRef ds:uri="http://schemas.microsoft.com/office/2006/documentManagement/types"/>
+    <ds:schemaRef ds:uri="http://schemas.microsoft.com/office/infopath/2007/PartnerControls"/>
+    <ds:schemaRef ds:uri="http://schemas.openxmlformats.org/package/2006/metadata/core-properties"/>
+    <ds:schemaRef ds:uri="http://purl.org/dc/elements/1.1/"/>
+    <ds:schemaRef ds:uri="http://purl.org/dc/terms/"/>
+    <ds:schemaRef ds:uri="http://schemas.microsoft.com/internal/obd"/>
+  </ds:schemaRefs>
+</ds:datastoreItem>
 </file>
 
 <file path=customXml/itemProps3.xml><?xml version="1.0" encoding="utf-8"?>
-<ds:datastoreItem xmlns:ds="http://schemas.openxmlformats.org/officeDocument/2006/customXml" ds:itemID="{0879AD43-6500-4156-A521-11C4987015EC}"/>
+<ds:datastoreItem xmlns:ds="http://schemas.openxmlformats.org/officeDocument/2006/customXml" ds:itemID="{0879AD43-6500-4156-A521-11C4987015EC}">
+  <ds:schemaRefs>
+    <ds:schemaRef ds:uri="http://schemas.microsoft.com/office/2006/metadata/properties"/>
+    <ds:schemaRef ds:uri="http://schemas.microsoft.com/office/infopath/2007/PartnerControls"/>
+  </ds:schemaRefs>
+</ds:datastoreItem>
 </file>
</xml_diff>

<commit_message>
Photos pour le fichier de base de données
</commit_message>
<xml_diff>
--- a/BASE_DE_DONNEES_RELATIONNELLE/Cours13/Cours13_Revision.docx
+++ b/BASE_DE_DONNEES_RELATIONNELLE/Cours13/Cours13_Revision.docx
@@ -4,7 +4,7 @@
   <w:body>
     <w:p>
       <w:pPr>
-        <w:pStyle w:val="Heading1"/>
+        <w:pStyle w:val="Titre1"/>
         <w:spacing w:line="360" w:lineRule="auto"/>
         <w:rPr>
           <w:rFonts w:ascii="Calibri" w:hAnsi="Calibri" w:cs="Calibri"/>
@@ -31,7 +31,7 @@
     </w:p>
     <w:p>
       <w:pPr>
-        <w:pStyle w:val="Heading3"/>
+        <w:pStyle w:val="Titre3"/>
         <w:spacing w:line="360" w:lineRule="auto"/>
         <w:rPr>
           <w:rFonts w:ascii="Calibri" w:hAnsi="Calibri" w:cs="Calibri"/>
@@ -52,7 +52,7 @@
     </w:p>
     <w:p>
       <w:pPr>
-        <w:pStyle w:val="ListParagraph"/>
+        <w:pStyle w:val="Paragraphedeliste"/>
         <w:numPr>
           <w:ilvl w:val="0"/>
           <w:numId w:val="8"/>
@@ -94,7 +94,58 @@
     </w:p>
     <w:p>
       <w:pPr>
-        <w:pStyle w:val="ListParagraph"/>
+        <w:pStyle w:val="Paragraphedeliste"/>
+        <w:spacing w:line="360" w:lineRule="auto"/>
+        <w:rPr>
+          <w:rFonts w:ascii="Calibri" w:hAnsi="Calibri" w:cs="Calibri"/>
+          <w:lang w:val="fr-FR"/>
+        </w:rPr>
+      </w:pPr>
+      <w:r>
+        <w:rPr>
+          <w:rFonts w:ascii="Calibri" w:hAnsi="Calibri" w:cs="Calibri"/>
+          <w:lang w:val="fr-FR"/>
+        </w:rPr>
+        <w:drawing>
+          <wp:inline distT="0" distB="0" distL="0" distR="0" wp14:anchorId="04109267" wp14:editId="0ACD239B">
+            <wp:extent cx="4486901" cy="476316"/>
+            <wp:effectExtent l="0" t="0" r="9525" b="0"/>
+            <wp:docPr id="1248592298" name="Image 1"/>
+            <wp:cNvGraphicFramePr>
+              <a:graphicFrameLocks xmlns:a="http://schemas.openxmlformats.org/drawingml/2006/main" noChangeAspect="1"/>
+            </wp:cNvGraphicFramePr>
+            <a:graphic xmlns:a="http://schemas.openxmlformats.org/drawingml/2006/main">
+              <a:graphicData uri="http://schemas.openxmlformats.org/drawingml/2006/picture">
+                <pic:pic xmlns:pic="http://schemas.openxmlformats.org/drawingml/2006/picture">
+                  <pic:nvPicPr>
+                    <pic:cNvPr id="1248592298" name=""/>
+                    <pic:cNvPicPr/>
+                  </pic:nvPicPr>
+                  <pic:blipFill>
+                    <a:blip r:embed="rId8"/>
+                    <a:stretch>
+                      <a:fillRect/>
+                    </a:stretch>
+                  </pic:blipFill>
+                  <pic:spPr>
+                    <a:xfrm>
+                      <a:off x="0" y="0"/>
+                      <a:ext cx="4486901" cy="476316"/>
+                    </a:xfrm>
+                    <a:prstGeom prst="rect">
+                      <a:avLst/>
+                    </a:prstGeom>
+                  </pic:spPr>
+                </pic:pic>
+              </a:graphicData>
+            </a:graphic>
+          </wp:inline>
+        </w:drawing>
+      </w:r>
+    </w:p>
+    <w:p>
+      <w:pPr>
+        <w:pStyle w:val="Paragraphedeliste"/>
         <w:numPr>
           <w:ilvl w:val="0"/>
           <w:numId w:val="8"/>
@@ -124,12 +175,79 @@
           <w:rFonts w:ascii="Calibri" w:hAnsi="Calibri" w:cs="Calibri"/>
           <w:lang w:val="fr-FR"/>
         </w:rPr>
-        <w:t xml:space="preserve"> dans le Pokédex. Triez cette liste du plus grand au plus petit.</w:t>
+        <w:t xml:space="preserve"> dans le </w:t>
+      </w:r>
+      <w:proofErr w:type="spellStart"/>
+      <w:r>
+        <w:rPr>
+          <w:rFonts w:ascii="Calibri" w:hAnsi="Calibri" w:cs="Calibri"/>
+          <w:lang w:val="fr-FR"/>
+        </w:rPr>
+        <w:t>Pokédex</w:t>
+      </w:r>
+      <w:proofErr w:type="spellEnd"/>
+      <w:r>
+        <w:rPr>
+          <w:rFonts w:ascii="Calibri" w:hAnsi="Calibri" w:cs="Calibri"/>
+          <w:lang w:val="fr-FR"/>
+        </w:rPr>
+        <w:t>. Triez cette liste du plus grand au plus petit.</w:t>
       </w:r>
     </w:p>
     <w:p>
       <w:pPr>
-        <w:pStyle w:val="ListParagraph"/>
+        <w:pStyle w:val="Paragraphedeliste"/>
+        <w:spacing w:line="360" w:lineRule="auto"/>
+        <w:rPr>
+          <w:rFonts w:ascii="Calibri" w:hAnsi="Calibri" w:cs="Calibri"/>
+          <w:lang w:val="fr-FR"/>
+        </w:rPr>
+      </w:pPr>
+      <w:r>
+        <w:rPr>
+          <w:rFonts w:ascii="Calibri" w:hAnsi="Calibri" w:cs="Calibri"/>
+          <w:lang w:val="fr-FR"/>
+        </w:rPr>
+        <w:drawing>
+          <wp:inline distT="0" distB="0" distL="0" distR="0" wp14:anchorId="4DA2395D" wp14:editId="637F7ABA">
+            <wp:extent cx="5068007" cy="695422"/>
+            <wp:effectExtent l="0" t="0" r="0" b="9525"/>
+            <wp:docPr id="400376719" name="Image 1"/>
+            <wp:cNvGraphicFramePr>
+              <a:graphicFrameLocks xmlns:a="http://schemas.openxmlformats.org/drawingml/2006/main" noChangeAspect="1"/>
+            </wp:cNvGraphicFramePr>
+            <a:graphic xmlns:a="http://schemas.openxmlformats.org/drawingml/2006/main">
+              <a:graphicData uri="http://schemas.openxmlformats.org/drawingml/2006/picture">
+                <pic:pic xmlns:pic="http://schemas.openxmlformats.org/drawingml/2006/picture">
+                  <pic:nvPicPr>
+                    <pic:cNvPr id="400376719" name=""/>
+                    <pic:cNvPicPr/>
+                  </pic:nvPicPr>
+                  <pic:blipFill>
+                    <a:blip r:embed="rId9"/>
+                    <a:stretch>
+                      <a:fillRect/>
+                    </a:stretch>
+                  </pic:blipFill>
+                  <pic:spPr>
+                    <a:xfrm>
+                      <a:off x="0" y="0"/>
+                      <a:ext cx="5068007" cy="695422"/>
+                    </a:xfrm>
+                    <a:prstGeom prst="rect">
+                      <a:avLst/>
+                    </a:prstGeom>
+                  </pic:spPr>
+                </pic:pic>
+              </a:graphicData>
+            </a:graphic>
+          </wp:inline>
+        </w:drawing>
+      </w:r>
+    </w:p>
+    <w:p>
+      <w:pPr>
+        <w:pStyle w:val="Paragraphedeliste"/>
         <w:numPr>
           <w:ilvl w:val="0"/>
           <w:numId w:val="8"/>
@@ -150,7 +268,58 @@
     </w:p>
     <w:p>
       <w:pPr>
-        <w:pStyle w:val="ListParagraph"/>
+        <w:pStyle w:val="Paragraphedeliste"/>
+        <w:spacing w:line="360" w:lineRule="auto"/>
+        <w:rPr>
+          <w:rFonts w:ascii="Calibri" w:hAnsi="Calibri" w:cs="Calibri"/>
+          <w:lang w:val="fr-FR"/>
+        </w:rPr>
+      </w:pPr>
+      <w:r>
+        <w:rPr>
+          <w:rFonts w:ascii="Calibri" w:hAnsi="Calibri" w:cs="Calibri"/>
+          <w:lang w:val="fr-FR"/>
+        </w:rPr>
+        <w:drawing>
+          <wp:inline distT="0" distB="0" distL="0" distR="0" wp14:anchorId="56F3B4E1" wp14:editId="5E6F01CA">
+            <wp:extent cx="4991797" cy="781159"/>
+            <wp:effectExtent l="0" t="0" r="0" b="0"/>
+            <wp:docPr id="245715915" name="Image 1"/>
+            <wp:cNvGraphicFramePr>
+              <a:graphicFrameLocks xmlns:a="http://schemas.openxmlformats.org/drawingml/2006/main" noChangeAspect="1"/>
+            </wp:cNvGraphicFramePr>
+            <a:graphic xmlns:a="http://schemas.openxmlformats.org/drawingml/2006/main">
+              <a:graphicData uri="http://schemas.openxmlformats.org/drawingml/2006/picture">
+                <pic:pic xmlns:pic="http://schemas.openxmlformats.org/drawingml/2006/picture">
+                  <pic:nvPicPr>
+                    <pic:cNvPr id="245715915" name=""/>
+                    <pic:cNvPicPr/>
+                  </pic:nvPicPr>
+                  <pic:blipFill>
+                    <a:blip r:embed="rId10"/>
+                    <a:stretch>
+                      <a:fillRect/>
+                    </a:stretch>
+                  </pic:blipFill>
+                  <pic:spPr>
+                    <a:xfrm>
+                      <a:off x="0" y="0"/>
+                      <a:ext cx="4991797" cy="781159"/>
+                    </a:xfrm>
+                    <a:prstGeom prst="rect">
+                      <a:avLst/>
+                    </a:prstGeom>
+                  </pic:spPr>
+                </pic:pic>
+              </a:graphicData>
+            </a:graphic>
+          </wp:inline>
+        </w:drawing>
+      </w:r>
+    </w:p>
+    <w:p>
+      <w:pPr>
+        <w:pStyle w:val="Paragraphedeliste"/>
         <w:numPr>
           <w:ilvl w:val="0"/>
           <w:numId w:val="8"/>
@@ -185,7 +354,58 @@
     </w:p>
     <w:p>
       <w:pPr>
-        <w:pStyle w:val="ListParagraph"/>
+        <w:pStyle w:val="Paragraphedeliste"/>
+        <w:spacing w:line="360" w:lineRule="auto"/>
+        <w:rPr>
+          <w:rFonts w:ascii="Calibri" w:hAnsi="Calibri" w:cs="Calibri"/>
+          <w:lang w:val="fr-FR"/>
+        </w:rPr>
+      </w:pPr>
+      <w:r>
+        <w:rPr>
+          <w:rFonts w:ascii="Calibri" w:hAnsi="Calibri" w:cs="Calibri"/>
+          <w:lang w:val="fr-FR"/>
+        </w:rPr>
+        <w:drawing>
+          <wp:inline distT="0" distB="0" distL="0" distR="0" wp14:anchorId="14C6D75E" wp14:editId="2B40DCD5">
+            <wp:extent cx="4791744" cy="819264"/>
+            <wp:effectExtent l="0" t="0" r="8890" b="0"/>
+            <wp:docPr id="392530984" name="Image 1"/>
+            <wp:cNvGraphicFramePr>
+              <a:graphicFrameLocks xmlns:a="http://schemas.openxmlformats.org/drawingml/2006/main" noChangeAspect="1"/>
+            </wp:cNvGraphicFramePr>
+            <a:graphic xmlns:a="http://schemas.openxmlformats.org/drawingml/2006/main">
+              <a:graphicData uri="http://schemas.openxmlformats.org/drawingml/2006/picture">
+                <pic:pic xmlns:pic="http://schemas.openxmlformats.org/drawingml/2006/picture">
+                  <pic:nvPicPr>
+                    <pic:cNvPr id="392530984" name=""/>
+                    <pic:cNvPicPr/>
+                  </pic:nvPicPr>
+                  <pic:blipFill>
+                    <a:blip r:embed="rId11"/>
+                    <a:stretch>
+                      <a:fillRect/>
+                    </a:stretch>
+                  </pic:blipFill>
+                  <pic:spPr>
+                    <a:xfrm>
+                      <a:off x="0" y="0"/>
+                      <a:ext cx="4791744" cy="819264"/>
+                    </a:xfrm>
+                    <a:prstGeom prst="rect">
+                      <a:avLst/>
+                    </a:prstGeom>
+                  </pic:spPr>
+                </pic:pic>
+              </a:graphicData>
+            </a:graphic>
+          </wp:inline>
+        </w:drawing>
+      </w:r>
+    </w:p>
+    <w:p>
+      <w:pPr>
+        <w:pStyle w:val="Paragraphedeliste"/>
         <w:numPr>
           <w:ilvl w:val="0"/>
           <w:numId w:val="8"/>
@@ -203,12 +423,21 @@
         </w:rPr>
         <w:t xml:space="preserve">Sortez la liste des lieux de rencontre dont les dresseurs ont capturé le plus des Pokémon dont le type de </w:t>
       </w:r>
-      <w:r>
-        <w:rPr>
-          <w:rFonts w:ascii="Calibri" w:hAnsi="Calibri" w:cs="Calibri"/>
-          <w:lang w:val="fr-FR"/>
-        </w:rPr>
-        <w:t xml:space="preserve">tera </w:t>
+      <w:proofErr w:type="spellStart"/>
+      <w:r>
+        <w:rPr>
+          <w:rFonts w:ascii="Calibri" w:hAnsi="Calibri" w:cs="Calibri"/>
+          <w:lang w:val="fr-FR"/>
+        </w:rPr>
+        <w:t>tera</w:t>
+      </w:r>
+      <w:proofErr w:type="spellEnd"/>
+      <w:r>
+        <w:rPr>
+          <w:rFonts w:ascii="Calibri" w:hAnsi="Calibri" w:cs="Calibri"/>
+          <w:lang w:val="fr-FR"/>
+        </w:rPr>
+        <w:t xml:space="preserve"> </w:t>
       </w:r>
       <w:r>
         <w:rPr>
@@ -229,7 +458,23 @@
           <w:rFonts w:ascii="Calibri" w:hAnsi="Calibri" w:cs="Calibri"/>
           <w:lang w:val="fr-FR"/>
         </w:rPr>
-        <w:t>(tera_type)</w:t>
+        <w:t>(</w:t>
+      </w:r>
+      <w:proofErr w:type="spellStart"/>
+      <w:r>
+        <w:rPr>
+          <w:rFonts w:ascii="Calibri" w:hAnsi="Calibri" w:cs="Calibri"/>
+          <w:lang w:val="fr-FR"/>
+        </w:rPr>
+        <w:t>tera_type</w:t>
+      </w:r>
+      <w:proofErr w:type="spellEnd"/>
+      <w:r>
+        <w:rPr>
+          <w:rFonts w:ascii="Calibri" w:hAnsi="Calibri" w:cs="Calibri"/>
+          <w:lang w:val="fr-FR"/>
+        </w:rPr>
+        <w:t>)</w:t>
       </w:r>
       <w:r>
         <w:rPr>
@@ -241,7 +486,59 @@
     </w:p>
     <w:p>
       <w:pPr>
-        <w:pStyle w:val="ListParagraph"/>
+        <w:pStyle w:val="Paragraphedeliste"/>
+        <w:spacing w:line="360" w:lineRule="auto"/>
+        <w:rPr>
+          <w:rFonts w:ascii="Calibri" w:hAnsi="Calibri" w:cs="Calibri"/>
+          <w:lang w:val="fr-FR"/>
+        </w:rPr>
+      </w:pPr>
+      <w:r>
+        <w:rPr>
+          <w:rFonts w:ascii="Calibri" w:hAnsi="Calibri" w:cs="Calibri"/>
+          <w:lang w:val="fr-FR"/>
+        </w:rPr>
+        <w:lastRenderedPageBreak/>
+        <w:drawing>
+          <wp:inline distT="0" distB="0" distL="0" distR="0" wp14:anchorId="59891B7A" wp14:editId="7BEFECE3">
+            <wp:extent cx="5506218" cy="1114581"/>
+            <wp:effectExtent l="0" t="0" r="0" b="9525"/>
+            <wp:docPr id="1068137159" name="Image 1"/>
+            <wp:cNvGraphicFramePr>
+              <a:graphicFrameLocks xmlns:a="http://schemas.openxmlformats.org/drawingml/2006/main" noChangeAspect="1"/>
+            </wp:cNvGraphicFramePr>
+            <a:graphic xmlns:a="http://schemas.openxmlformats.org/drawingml/2006/main">
+              <a:graphicData uri="http://schemas.openxmlformats.org/drawingml/2006/picture">
+                <pic:pic xmlns:pic="http://schemas.openxmlformats.org/drawingml/2006/picture">
+                  <pic:nvPicPr>
+                    <pic:cNvPr id="1068137159" name=""/>
+                    <pic:cNvPicPr/>
+                  </pic:nvPicPr>
+                  <pic:blipFill>
+                    <a:blip r:embed="rId12"/>
+                    <a:stretch>
+                      <a:fillRect/>
+                    </a:stretch>
+                  </pic:blipFill>
+                  <pic:spPr>
+                    <a:xfrm>
+                      <a:off x="0" y="0"/>
+                      <a:ext cx="5506218" cy="1114581"/>
+                    </a:xfrm>
+                    <a:prstGeom prst="rect">
+                      <a:avLst/>
+                    </a:prstGeom>
+                  </pic:spPr>
+                </pic:pic>
+              </a:graphicData>
+            </a:graphic>
+          </wp:inline>
+        </w:drawing>
+      </w:r>
+    </w:p>
+    <w:p>
+      <w:pPr>
+        <w:pStyle w:val="Paragraphedeliste"/>
         <w:numPr>
           <w:ilvl w:val="0"/>
           <w:numId w:val="8"/>
@@ -276,7 +573,58 @@
     </w:p>
     <w:p>
       <w:pPr>
-        <w:pStyle w:val="ListParagraph"/>
+        <w:pStyle w:val="Paragraphedeliste"/>
+        <w:spacing w:line="360" w:lineRule="auto"/>
+        <w:rPr>
+          <w:rFonts w:ascii="Calibri" w:hAnsi="Calibri" w:cs="Calibri"/>
+          <w:lang w:val="fr-FR"/>
+        </w:rPr>
+      </w:pPr>
+      <w:r>
+        <w:rPr>
+          <w:rFonts w:ascii="Calibri" w:hAnsi="Calibri" w:cs="Calibri"/>
+          <w:lang w:val="fr-FR"/>
+        </w:rPr>
+        <w:drawing>
+          <wp:inline distT="0" distB="0" distL="0" distR="0" wp14:anchorId="01540E37" wp14:editId="10B1F720">
+            <wp:extent cx="5363323" cy="809738"/>
+            <wp:effectExtent l="0" t="0" r="8890" b="9525"/>
+            <wp:docPr id="508659742" name="Image 1"/>
+            <wp:cNvGraphicFramePr>
+              <a:graphicFrameLocks xmlns:a="http://schemas.openxmlformats.org/drawingml/2006/main" noChangeAspect="1"/>
+            </wp:cNvGraphicFramePr>
+            <a:graphic xmlns:a="http://schemas.openxmlformats.org/drawingml/2006/main">
+              <a:graphicData uri="http://schemas.openxmlformats.org/drawingml/2006/picture">
+                <pic:pic xmlns:pic="http://schemas.openxmlformats.org/drawingml/2006/picture">
+                  <pic:nvPicPr>
+                    <pic:cNvPr id="508659742" name=""/>
+                    <pic:cNvPicPr/>
+                  </pic:nvPicPr>
+                  <pic:blipFill>
+                    <a:blip r:embed="rId13"/>
+                    <a:stretch>
+                      <a:fillRect/>
+                    </a:stretch>
+                  </pic:blipFill>
+                  <pic:spPr>
+                    <a:xfrm>
+                      <a:off x="0" y="0"/>
+                      <a:ext cx="5363323" cy="809738"/>
+                    </a:xfrm>
+                    <a:prstGeom prst="rect">
+                      <a:avLst/>
+                    </a:prstGeom>
+                  </pic:spPr>
+                </pic:pic>
+              </a:graphicData>
+            </a:graphic>
+          </wp:inline>
+        </w:drawing>
+      </w:r>
+    </w:p>
+    <w:p>
+      <w:pPr>
+        <w:pStyle w:val="Paragraphedeliste"/>
         <w:numPr>
           <w:ilvl w:val="0"/>
           <w:numId w:val="8"/>
@@ -287,6 +635,7 @@
           <w:lang w:val="fr-FR"/>
         </w:rPr>
       </w:pPr>
+      <w:proofErr w:type="gramStart"/>
       <w:r>
         <w:rPr>
           <w:rFonts w:ascii="Calibri" w:hAnsi="Calibri" w:cs="Calibri"/>
@@ -294,6 +643,7 @@
         </w:rPr>
         <w:t>Sortez le</w:t>
       </w:r>
+      <w:proofErr w:type="gramEnd"/>
       <w:r>
         <w:rPr>
           <w:rFonts w:ascii="Calibri" w:hAnsi="Calibri" w:cs="Calibri"/>
@@ -306,7 +656,23 @@
           <w:rFonts w:ascii="Calibri" w:hAnsi="Calibri" w:cs="Calibri"/>
           <w:lang w:val="fr-FR"/>
         </w:rPr>
-        <w:t>des Pokémon « shiny » qui date</w:t>
+        <w:t>des Pokémon « </w:t>
+      </w:r>
+      <w:proofErr w:type="spellStart"/>
+      <w:r>
+        <w:rPr>
+          <w:rFonts w:ascii="Calibri" w:hAnsi="Calibri" w:cs="Calibri"/>
+          <w:lang w:val="fr-FR"/>
+        </w:rPr>
+        <w:t>shiny</w:t>
+      </w:r>
+      <w:proofErr w:type="spellEnd"/>
+      <w:r>
+        <w:rPr>
+          <w:rFonts w:ascii="Calibri" w:hAnsi="Calibri" w:cs="Calibri"/>
+          <w:lang w:val="fr-FR"/>
+        </w:rPr>
+        <w:t> » qui date</w:t>
       </w:r>
       <w:r>
         <w:rPr>
@@ -325,7 +691,58 @@
     </w:p>
     <w:p>
       <w:pPr>
-        <w:pStyle w:val="ListParagraph"/>
+        <w:pStyle w:val="Paragraphedeliste"/>
+        <w:spacing w:line="360" w:lineRule="auto"/>
+        <w:rPr>
+          <w:rFonts w:ascii="Calibri" w:hAnsi="Calibri" w:cs="Calibri"/>
+          <w:lang w:val="fr-FR"/>
+        </w:rPr>
+      </w:pPr>
+      <w:r>
+        <w:rPr>
+          <w:rFonts w:ascii="Calibri" w:hAnsi="Calibri" w:cs="Calibri"/>
+          <w:lang w:val="fr-FR"/>
+        </w:rPr>
+        <w:drawing>
+          <wp:inline distT="0" distB="0" distL="0" distR="0" wp14:anchorId="33282D7D" wp14:editId="16536018">
+            <wp:extent cx="5943600" cy="688340"/>
+            <wp:effectExtent l="0" t="0" r="0" b="0"/>
+            <wp:docPr id="703988806" name="Image 1"/>
+            <wp:cNvGraphicFramePr>
+              <a:graphicFrameLocks xmlns:a="http://schemas.openxmlformats.org/drawingml/2006/main" noChangeAspect="1"/>
+            </wp:cNvGraphicFramePr>
+            <a:graphic xmlns:a="http://schemas.openxmlformats.org/drawingml/2006/main">
+              <a:graphicData uri="http://schemas.openxmlformats.org/drawingml/2006/picture">
+                <pic:pic xmlns:pic="http://schemas.openxmlformats.org/drawingml/2006/picture">
+                  <pic:nvPicPr>
+                    <pic:cNvPr id="703988806" name=""/>
+                    <pic:cNvPicPr/>
+                  </pic:nvPicPr>
+                  <pic:blipFill>
+                    <a:blip r:embed="rId14"/>
+                    <a:stretch>
+                      <a:fillRect/>
+                    </a:stretch>
+                  </pic:blipFill>
+                  <pic:spPr>
+                    <a:xfrm>
+                      <a:off x="0" y="0"/>
+                      <a:ext cx="5943600" cy="688340"/>
+                    </a:xfrm>
+                    <a:prstGeom prst="rect">
+                      <a:avLst/>
+                    </a:prstGeom>
+                  </pic:spPr>
+                </pic:pic>
+              </a:graphicData>
+            </a:graphic>
+          </wp:inline>
+        </w:drawing>
+      </w:r>
+    </w:p>
+    <w:p>
+      <w:pPr>
+        <w:pStyle w:val="Paragraphedeliste"/>
         <w:numPr>
           <w:ilvl w:val="0"/>
           <w:numId w:val="8"/>
@@ -341,8 +758,17 @@
           <w:rFonts w:ascii="Calibri" w:hAnsi="Calibri" w:cs="Calibri"/>
           <w:lang w:val="fr-FR"/>
         </w:rPr>
-        <w:t>Sortez la liste des 25 premier Pokémon du Pokédex</w:t>
-      </w:r>
+        <w:t xml:space="preserve">Sortez la liste des 25 premier Pokémon du </w:t>
+      </w:r>
+      <w:proofErr w:type="spellStart"/>
+      <w:r>
+        <w:rPr>
+          <w:rFonts w:ascii="Calibri" w:hAnsi="Calibri" w:cs="Calibri"/>
+          <w:lang w:val="fr-FR"/>
+        </w:rPr>
+        <w:t>Pokédex</w:t>
+      </w:r>
+      <w:proofErr w:type="spellEnd"/>
       <w:r>
         <w:rPr>
           <w:rFonts w:ascii="Calibri" w:hAnsi="Calibri" w:cs="Calibri"/>
@@ -350,6 +776,57 @@
         </w:rPr>
         <w:t xml:space="preserve"> et réalisez l’affichage suivant :</w:t>
       </w:r>
+    </w:p>
+    <w:p>
+      <w:pPr>
+        <w:pStyle w:val="Paragraphedeliste"/>
+        <w:spacing w:line="360" w:lineRule="auto"/>
+        <w:rPr>
+          <w:rFonts w:ascii="Calibri" w:hAnsi="Calibri" w:cs="Calibri"/>
+          <w:lang w:val="fr-FR"/>
+        </w:rPr>
+      </w:pPr>
+      <w:r>
+        <w:rPr>
+          <w:rFonts w:ascii="Calibri" w:hAnsi="Calibri" w:cs="Calibri"/>
+          <w:lang w:val="fr-FR"/>
+        </w:rPr>
+        <w:drawing>
+          <wp:inline distT="0" distB="0" distL="0" distR="0" wp14:anchorId="24C001E5" wp14:editId="38419C47">
+            <wp:extent cx="5943600" cy="805815"/>
+            <wp:effectExtent l="0" t="0" r="0" b="0"/>
+            <wp:docPr id="1739186645" name="Image 1"/>
+            <wp:cNvGraphicFramePr>
+              <a:graphicFrameLocks xmlns:a="http://schemas.openxmlformats.org/drawingml/2006/main" noChangeAspect="1"/>
+            </wp:cNvGraphicFramePr>
+            <a:graphic xmlns:a="http://schemas.openxmlformats.org/drawingml/2006/main">
+              <a:graphicData uri="http://schemas.openxmlformats.org/drawingml/2006/picture">
+                <pic:pic xmlns:pic="http://schemas.openxmlformats.org/drawingml/2006/picture">
+                  <pic:nvPicPr>
+                    <pic:cNvPr id="1739186645" name=""/>
+                    <pic:cNvPicPr/>
+                  </pic:nvPicPr>
+                  <pic:blipFill>
+                    <a:blip r:embed="rId15"/>
+                    <a:stretch>
+                      <a:fillRect/>
+                    </a:stretch>
+                  </pic:blipFill>
+                  <pic:spPr>
+                    <a:xfrm>
+                      <a:off x="0" y="0"/>
+                      <a:ext cx="5943600" cy="805815"/>
+                    </a:xfrm>
+                    <a:prstGeom prst="rect">
+                      <a:avLst/>
+                    </a:prstGeom>
+                  </pic:spPr>
+                </pic:pic>
+              </a:graphicData>
+            </a:graphic>
+          </wp:inline>
+        </w:drawing>
+      </w:r>
       <w:r>
         <w:rPr>
           <w:rFonts w:ascii="Calibri" w:hAnsi="Calibri" w:cs="Calibri"/>
@@ -360,6 +837,7 @@
       <w:r>
         <w:rPr>
           <w:rFonts w:ascii="Calibri" w:hAnsi="Calibri" w:cs="Calibri"/>
+          <w:noProof/>
           <w:lang w:val="fr-FR"/>
         </w:rPr>
         <w:drawing>
@@ -378,7 +856,7 @@
                     <pic:cNvPicPr/>
                   </pic:nvPicPr>
                   <pic:blipFill>
-                    <a:blip r:embed="rId5"/>
+                    <a:blip r:embed="rId16"/>
                     <a:stretch>
                       <a:fillRect/>
                     </a:stretch>
@@ -401,7 +879,7 @@
     </w:p>
     <w:p>
       <w:pPr>
-        <w:pStyle w:val="ListParagraph"/>
+        <w:pStyle w:val="Paragraphedeliste"/>
         <w:numPr>
           <w:ilvl w:val="0"/>
           <w:numId w:val="8"/>
@@ -431,7 +909,39 @@
           <w:rFonts w:ascii="Calibri" w:hAnsi="Calibri" w:cs="Calibri"/>
           <w:lang w:val="fr-FR"/>
         </w:rPr>
-        <w:t>dresseurs qui ont au moins 2 pokémon « shiny »</w:t>
+        <w:t xml:space="preserve">dresseurs qui ont au moins 2 </w:t>
+      </w:r>
+      <w:proofErr w:type="gramStart"/>
+      <w:r>
+        <w:rPr>
+          <w:rFonts w:ascii="Calibri" w:hAnsi="Calibri" w:cs="Calibri"/>
+          <w:lang w:val="fr-FR"/>
+        </w:rPr>
+        <w:t>pokémon</w:t>
+      </w:r>
+      <w:proofErr w:type="gramEnd"/>
+      <w:r>
+        <w:rPr>
+          <w:rFonts w:ascii="Calibri" w:hAnsi="Calibri" w:cs="Calibri"/>
+          <w:lang w:val="fr-FR"/>
+        </w:rPr>
+        <w:t xml:space="preserve"> « </w:t>
+      </w:r>
+      <w:proofErr w:type="spellStart"/>
+      <w:r>
+        <w:rPr>
+          <w:rFonts w:ascii="Calibri" w:hAnsi="Calibri" w:cs="Calibri"/>
+          <w:lang w:val="fr-FR"/>
+        </w:rPr>
+        <w:t>shiny</w:t>
+      </w:r>
+      <w:proofErr w:type="spellEnd"/>
+      <w:r>
+        <w:rPr>
+          <w:rFonts w:ascii="Calibri" w:hAnsi="Calibri" w:cs="Calibri"/>
+          <w:lang w:val="fr-FR"/>
+        </w:rPr>
+        <w:t> »</w:t>
       </w:r>
       <w:r>
         <w:rPr>
@@ -443,7 +953,17 @@
     </w:p>
     <w:p>
       <w:pPr>
-        <w:pStyle w:val="ListParagraph"/>
+        <w:pStyle w:val="Paragraphedeliste"/>
+        <w:spacing w:line="360" w:lineRule="auto"/>
+        <w:rPr>
+          <w:rFonts w:ascii="Calibri" w:hAnsi="Calibri" w:cs="Calibri"/>
+          <w:lang w:val="fr-FR"/>
+        </w:rPr>
+      </w:pPr>
+    </w:p>
+    <w:p>
+      <w:pPr>
+        <w:pStyle w:val="Paragraphedeliste"/>
         <w:numPr>
           <w:ilvl w:val="0"/>
           <w:numId w:val="8"/>
@@ -459,7 +979,23 @@
           <w:rFonts w:ascii="Calibri" w:hAnsi="Calibri" w:cs="Calibri"/>
           <w:lang w:val="fr-FR"/>
         </w:rPr>
-        <w:t xml:space="preserve">Dans le Pokédex, trouvez </w:t>
+        <w:t xml:space="preserve">Dans le </w:t>
+      </w:r>
+      <w:proofErr w:type="spellStart"/>
+      <w:r>
+        <w:rPr>
+          <w:rFonts w:ascii="Calibri" w:hAnsi="Calibri" w:cs="Calibri"/>
+          <w:lang w:val="fr-FR"/>
+        </w:rPr>
+        <w:t>Pokédex</w:t>
+      </w:r>
+      <w:proofErr w:type="spellEnd"/>
+      <w:r>
+        <w:rPr>
+          <w:rFonts w:ascii="Calibri" w:hAnsi="Calibri" w:cs="Calibri"/>
+          <w:lang w:val="fr-FR"/>
+        </w:rPr>
+        <w:t xml:space="preserve">, trouvez </w:t>
       </w:r>
       <w:r>
         <w:rPr>
@@ -473,7 +1009,23 @@
           <w:rFonts w:ascii="Calibri" w:hAnsi="Calibri" w:cs="Calibri"/>
           <w:lang w:val="fr-FR"/>
         </w:rPr>
-        <w:t>, n’oubliez pas de renommer les colonnes, les 18 hahaha.</w:t>
+        <w:t xml:space="preserve">, n’oubliez pas de renommer les colonnes, les 18 </w:t>
+      </w:r>
+      <w:proofErr w:type="spellStart"/>
+      <w:r>
+        <w:rPr>
+          <w:rFonts w:ascii="Calibri" w:hAnsi="Calibri" w:cs="Calibri"/>
+          <w:lang w:val="fr-FR"/>
+        </w:rPr>
+        <w:t>hahaha</w:t>
+      </w:r>
+      <w:proofErr w:type="spellEnd"/>
+      <w:r>
+        <w:rPr>
+          <w:rFonts w:ascii="Calibri" w:hAnsi="Calibri" w:cs="Calibri"/>
+          <w:lang w:val="fr-FR"/>
+        </w:rPr>
+        <w:t>.</w:t>
       </w:r>
     </w:p>
     <w:p>
@@ -493,7 +1045,7 @@
     </w:p>
     <w:p>
       <w:pPr>
-        <w:pStyle w:val="ListParagraph"/>
+        <w:pStyle w:val="Paragraphedeliste"/>
         <w:numPr>
           <w:ilvl w:val="0"/>
           <w:numId w:val="8"/>
@@ -538,7 +1090,23 @@
           <w:rFonts w:ascii="Calibri" w:hAnsi="Calibri" w:cs="Calibri"/>
           <w:lang w:val="fr-FR"/>
         </w:rPr>
-        <w:t>Pokémon dans le Pokédex qui</w:t>
+        <w:t xml:space="preserve">Pokémon dans le </w:t>
+      </w:r>
+      <w:proofErr w:type="spellStart"/>
+      <w:r>
+        <w:rPr>
+          <w:rFonts w:ascii="Calibri" w:hAnsi="Calibri" w:cs="Calibri"/>
+          <w:lang w:val="fr-FR"/>
+        </w:rPr>
+        <w:t>Pokédex</w:t>
+      </w:r>
+      <w:proofErr w:type="spellEnd"/>
+      <w:r>
+        <w:rPr>
+          <w:rFonts w:ascii="Calibri" w:hAnsi="Calibri" w:cs="Calibri"/>
+          <w:lang w:val="fr-FR"/>
+        </w:rPr>
+        <w:t xml:space="preserve"> qui</w:t>
       </w:r>
       <w:r>
         <w:rPr>
@@ -578,6 +1146,7 @@
       <w:r>
         <w:rPr>
           <w:rFonts w:ascii="Calibri" w:hAnsi="Calibri" w:cs="Calibri"/>
+          <w:noProof/>
           <w:lang w:val="fr-FR"/>
         </w:rPr>
         <w:drawing>
@@ -596,7 +1165,7 @@
                     <pic:cNvPicPr/>
                   </pic:nvPicPr>
                   <pic:blipFill>
-                    <a:blip r:embed="rId6"/>
+                    <a:blip r:embed="rId17"/>
                     <a:stretch>
                       <a:fillRect/>
                     </a:stretch>
@@ -619,7 +1188,7 @@
     </w:p>
     <w:p>
       <w:pPr>
-        <w:pStyle w:val="ListParagraph"/>
+        <w:pStyle w:val="Paragraphedeliste"/>
         <w:numPr>
           <w:ilvl w:val="0"/>
           <w:numId w:val="8"/>
@@ -635,14 +1204,78 @@
           <w:rFonts w:ascii="Calibri" w:hAnsi="Calibri" w:cs="Calibri"/>
           <w:lang w:val="fr-FR"/>
         </w:rPr>
-        <w:t xml:space="preserve">On cherche pour une équipe compétitive des Pokémon (du Pokédex) qui sont rapides et robustes pour une équipe </w:t>
-      </w:r>
-      <w:r>
-        <w:rPr>
-          <w:rFonts w:ascii="Calibri" w:hAnsi="Calibri" w:cs="Calibri"/>
-          <w:lang w:val="fr-FR"/>
-        </w:rPr>
-        <w:t xml:space="preserve">de style « Bulky Offense ». Voici les pré-requis, la vitesse de base doit être supérieure à 90, les pv doivent être supérieurs à 90, le type 1 doit être </w:t>
+        <w:t xml:space="preserve">On cherche pour une équipe compétitive des Pokémon (du </w:t>
+      </w:r>
+      <w:proofErr w:type="spellStart"/>
+      <w:r>
+        <w:rPr>
+          <w:rFonts w:ascii="Calibri" w:hAnsi="Calibri" w:cs="Calibri"/>
+          <w:lang w:val="fr-FR"/>
+        </w:rPr>
+        <w:t>Pokédex</w:t>
+      </w:r>
+      <w:proofErr w:type="spellEnd"/>
+      <w:r>
+        <w:rPr>
+          <w:rFonts w:ascii="Calibri" w:hAnsi="Calibri" w:cs="Calibri"/>
+          <w:lang w:val="fr-FR"/>
+        </w:rPr>
+        <w:t xml:space="preserve">) qui sont rapides et robustes pour une équipe </w:t>
+      </w:r>
+      <w:r>
+        <w:rPr>
+          <w:rFonts w:ascii="Calibri" w:hAnsi="Calibri" w:cs="Calibri"/>
+          <w:lang w:val="fr-FR"/>
+        </w:rPr>
+        <w:t>de style « </w:t>
+      </w:r>
+      <w:proofErr w:type="spellStart"/>
+      <w:r>
+        <w:rPr>
+          <w:rFonts w:ascii="Calibri" w:hAnsi="Calibri" w:cs="Calibri"/>
+          <w:lang w:val="fr-FR"/>
+        </w:rPr>
+        <w:t>Bulky</w:t>
+      </w:r>
+      <w:proofErr w:type="spellEnd"/>
+      <w:r>
+        <w:rPr>
+          <w:rFonts w:ascii="Calibri" w:hAnsi="Calibri" w:cs="Calibri"/>
+          <w:lang w:val="fr-FR"/>
+        </w:rPr>
+        <w:t xml:space="preserve"> Offense ». Voici les </w:t>
+      </w:r>
+      <w:proofErr w:type="spellStart"/>
+      <w:r>
+        <w:rPr>
+          <w:rFonts w:ascii="Calibri" w:hAnsi="Calibri" w:cs="Calibri"/>
+          <w:lang w:val="fr-FR"/>
+        </w:rPr>
+        <w:t>pré-requis</w:t>
+      </w:r>
+      <w:proofErr w:type="spellEnd"/>
+      <w:r>
+        <w:rPr>
+          <w:rFonts w:ascii="Calibri" w:hAnsi="Calibri" w:cs="Calibri"/>
+          <w:lang w:val="fr-FR"/>
+        </w:rPr>
+        <w:t xml:space="preserve">, la vitesse de base doit être supérieure à 90, les </w:t>
+      </w:r>
+      <w:proofErr w:type="spellStart"/>
+      <w:r>
+        <w:rPr>
+          <w:rFonts w:ascii="Calibri" w:hAnsi="Calibri" w:cs="Calibri"/>
+          <w:lang w:val="fr-FR"/>
+        </w:rPr>
+        <w:t>pv</w:t>
+      </w:r>
+      <w:proofErr w:type="spellEnd"/>
+      <w:r>
+        <w:rPr>
+          <w:rFonts w:ascii="Calibri" w:hAnsi="Calibri" w:cs="Calibri"/>
+          <w:lang w:val="fr-FR"/>
+        </w:rPr>
+        <w:t xml:space="preserve"> doivent être supérieurs à 90, le type 1 doit être </w:t>
       </w:r>
       <w:r>
         <w:rPr>
@@ -651,6 +1284,7 @@
         </w:rPr>
         <w:t>« </w:t>
       </w:r>
+      <w:proofErr w:type="spellStart"/>
       <w:r>
         <w:rPr>
           <w:rFonts w:ascii="Calibri" w:hAnsi="Calibri" w:cs="Calibri"/>
@@ -658,12 +1292,29 @@
         </w:rPr>
         <w:t>électrik</w:t>
       </w:r>
-      <w:r>
-        <w:rPr>
-          <w:rFonts w:ascii="Calibri" w:hAnsi="Calibri" w:cs="Calibri"/>
-          <w:lang w:val="fr-FR"/>
-        </w:rPr>
-        <w:t xml:space="preserve"> » ou « eau » et le numéro dans le Pokédex doit être </w:t>
+      <w:proofErr w:type="spellEnd"/>
+      <w:r>
+        <w:rPr>
+          <w:rFonts w:ascii="Calibri" w:hAnsi="Calibri" w:cs="Calibri"/>
+          <w:lang w:val="fr-FR"/>
+        </w:rPr>
+        <w:t xml:space="preserve"> » ou « eau » et le numéro dans le </w:t>
+      </w:r>
+      <w:proofErr w:type="spellStart"/>
+      <w:r>
+        <w:rPr>
+          <w:rFonts w:ascii="Calibri" w:hAnsi="Calibri" w:cs="Calibri"/>
+          <w:lang w:val="fr-FR"/>
+        </w:rPr>
+        <w:t>Pokédex</w:t>
+      </w:r>
+      <w:proofErr w:type="spellEnd"/>
+      <w:r>
+        <w:rPr>
+          <w:rFonts w:ascii="Calibri" w:hAnsi="Calibri" w:cs="Calibri"/>
+          <w:lang w:val="fr-FR"/>
+        </w:rPr>
+        <w:t xml:space="preserve"> doit être </w:t>
       </w:r>
       <w:r>
         <w:rPr>
@@ -675,7 +1326,7 @@
     </w:p>
     <w:p>
       <w:pPr>
-        <w:pStyle w:val="ListParagraph"/>
+        <w:pStyle w:val="Paragraphedeliste"/>
         <w:numPr>
           <w:ilvl w:val="0"/>
           <w:numId w:val="8"/>
@@ -691,12 +1342,28 @@
           <w:rFonts w:ascii="Calibri" w:hAnsi="Calibri" w:cs="Calibri"/>
           <w:lang w:val="fr-FR"/>
         </w:rPr>
-        <w:t>Vendredi prochain c’est ENCORE un vendredi 13. Such wow, Much incredible !</w:t>
+        <w:t xml:space="preserve">Vendredi prochain c’est ENCORE un vendredi 13. Such wow, Much </w:t>
+      </w:r>
+      <w:proofErr w:type="spellStart"/>
+      <w:r>
+        <w:rPr>
+          <w:rFonts w:ascii="Calibri" w:hAnsi="Calibri" w:cs="Calibri"/>
+          <w:lang w:val="fr-FR"/>
+        </w:rPr>
+        <w:t>incredible</w:t>
+      </w:r>
+      <w:proofErr w:type="spellEnd"/>
+      <w:r>
+        <w:rPr>
+          <w:rFonts w:ascii="Calibri" w:hAnsi="Calibri" w:cs="Calibri"/>
+          <w:lang w:val="fr-FR"/>
+        </w:rPr>
+        <w:t> !</w:t>
       </w:r>
     </w:p>
     <w:p>
       <w:pPr>
-        <w:pStyle w:val="ListParagraph"/>
+        <w:pStyle w:val="Paragraphedeliste"/>
         <w:numPr>
           <w:ilvl w:val="0"/>
           <w:numId w:val="8"/>
@@ -712,14 +1379,39 @@
           <w:rFonts w:ascii="Calibri" w:hAnsi="Calibri" w:cs="Calibri"/>
           <w:lang w:val="fr-FR"/>
         </w:rPr>
-        <w:t>Pour notre équipe ultra offensive, on veut les Pokémon du Pokédex</w:t>
-      </w:r>
-      <w:r>
-        <w:rPr>
-          <w:rFonts w:ascii="Calibri" w:hAnsi="Calibri" w:cs="Calibri"/>
-          <w:lang w:val="fr-FR"/>
-        </w:rPr>
-        <w:t xml:space="preserve"> qui sont de ce que l’on nomme en anglais « glass cannon ».</w:t>
+        <w:t xml:space="preserve">Pour notre équipe ultra offensive, on veut les Pokémon du </w:t>
+      </w:r>
+      <w:proofErr w:type="spellStart"/>
+      <w:r>
+        <w:rPr>
+          <w:rFonts w:ascii="Calibri" w:hAnsi="Calibri" w:cs="Calibri"/>
+          <w:lang w:val="fr-FR"/>
+        </w:rPr>
+        <w:t>Pokédex</w:t>
+      </w:r>
+      <w:proofErr w:type="spellEnd"/>
+      <w:r>
+        <w:rPr>
+          <w:rFonts w:ascii="Calibri" w:hAnsi="Calibri" w:cs="Calibri"/>
+          <w:lang w:val="fr-FR"/>
+        </w:rPr>
+        <w:t xml:space="preserve"> qui sont de ce que l’on nomme en anglais « glass </w:t>
+      </w:r>
+      <w:proofErr w:type="spellStart"/>
+      <w:r>
+        <w:rPr>
+          <w:rFonts w:ascii="Calibri" w:hAnsi="Calibri" w:cs="Calibri"/>
+          <w:lang w:val="fr-FR"/>
+        </w:rPr>
+        <w:t>cannon</w:t>
+      </w:r>
+      <w:proofErr w:type="spellEnd"/>
+      <w:r>
+        <w:rPr>
+          <w:rFonts w:ascii="Calibri" w:hAnsi="Calibri" w:cs="Calibri"/>
+          <w:lang w:val="fr-FR"/>
+        </w:rPr>
+        <w:t> ».</w:t>
       </w:r>
       <w:r>
         <w:rPr>
@@ -733,19 +1425,51 @@
           <w:rFonts w:ascii="Calibri" w:hAnsi="Calibri" w:cs="Calibri"/>
           <w:lang w:val="fr-FR"/>
         </w:rPr>
-        <w:t>spéciale (atq_spe) est supérieur à 110. La défense ou la</w:t>
-      </w:r>
-      <w:r>
-        <w:rPr>
-          <w:rFonts w:ascii="Calibri" w:hAnsi="Calibri" w:cs="Calibri"/>
-          <w:lang w:val="fr-FR"/>
-        </w:rPr>
-        <w:t xml:space="preserve"> défense spéciale (def_spe) doit être inférieure à 50. Le type_2 ne doit pas être NULL et le nom de l’espèce doit être plus long que 5 caractères !</w:t>
+        <w:t>spéciale (</w:t>
+      </w:r>
+      <w:proofErr w:type="spellStart"/>
+      <w:r>
+        <w:rPr>
+          <w:rFonts w:ascii="Calibri" w:hAnsi="Calibri" w:cs="Calibri"/>
+          <w:lang w:val="fr-FR"/>
+        </w:rPr>
+        <w:t>atq_spe</w:t>
+      </w:r>
+      <w:proofErr w:type="spellEnd"/>
+      <w:r>
+        <w:rPr>
+          <w:rFonts w:ascii="Calibri" w:hAnsi="Calibri" w:cs="Calibri"/>
+          <w:lang w:val="fr-FR"/>
+        </w:rPr>
+        <w:t>) est supérieur à 110. La défense ou la</w:t>
+      </w:r>
+      <w:r>
+        <w:rPr>
+          <w:rFonts w:ascii="Calibri" w:hAnsi="Calibri" w:cs="Calibri"/>
+          <w:lang w:val="fr-FR"/>
+        </w:rPr>
+        <w:t xml:space="preserve"> défense spéciale (</w:t>
+      </w:r>
+      <w:proofErr w:type="spellStart"/>
+      <w:r>
+        <w:rPr>
+          <w:rFonts w:ascii="Calibri" w:hAnsi="Calibri" w:cs="Calibri"/>
+          <w:lang w:val="fr-FR"/>
+        </w:rPr>
+        <w:t>def_spe</w:t>
+      </w:r>
+      <w:proofErr w:type="spellEnd"/>
+      <w:r>
+        <w:rPr>
+          <w:rFonts w:ascii="Calibri" w:hAnsi="Calibri" w:cs="Calibri"/>
+          <w:lang w:val="fr-FR"/>
+        </w:rPr>
+        <w:t>) doit être inférieure à 50. Le type_2 ne doit pas être NULL et le nom de l’espèce doit être plus long que 5 caractères !</w:t>
       </w:r>
     </w:p>
     <w:p>
       <w:pPr>
-        <w:pStyle w:val="ListParagraph"/>
+        <w:pStyle w:val="Paragraphedeliste"/>
         <w:numPr>
           <w:ilvl w:val="0"/>
           <w:numId w:val="8"/>
@@ -794,7 +1518,7 @@
     </w:p>
     <w:p>
       <w:pPr>
-        <w:pStyle w:val="ListParagraph"/>
+        <w:pStyle w:val="Paragraphedeliste"/>
         <w:spacing w:line="360" w:lineRule="auto"/>
         <w:rPr>
           <w:rFonts w:ascii="Calibri" w:hAnsi="Calibri" w:cs="Calibri"/>
@@ -804,6 +1528,7 @@
       <w:r>
         <w:rPr>
           <w:rFonts w:ascii="Calibri" w:hAnsi="Calibri" w:cs="Calibri"/>
+          <w:noProof/>
           <w:lang w:val="en-CA"/>
         </w:rPr>
         <w:drawing>
@@ -822,7 +1547,7 @@
                     <pic:cNvPicPr/>
                   </pic:nvPicPr>
                   <pic:blipFill>
-                    <a:blip r:embed="rId7"/>
+                    <a:blip r:embed="rId18"/>
                     <a:stretch>
                       <a:fillRect/>
                     </a:stretch>
@@ -2082,11 +2807,11 @@
       <w:lang w:val="fr-CA"/>
     </w:rPr>
   </w:style>
-  <w:style w:type="paragraph" w:styleId="Heading1">
+  <w:style w:type="paragraph" w:styleId="Titre1">
     <w:name w:val="heading 1"/>
     <w:basedOn w:val="Normal"/>
     <w:next w:val="Normal"/>
-    <w:link w:val="Heading1Char"/>
+    <w:link w:val="Titre1Car"/>
     <w:uiPriority w:val="9"/>
     <w:qFormat/>
     <w:rsid w:val="00A9640A"/>
@@ -2103,11 +2828,11 @@
       <w:szCs w:val="40"/>
     </w:rPr>
   </w:style>
-  <w:style w:type="paragraph" w:styleId="Heading2">
+  <w:style w:type="paragraph" w:styleId="Titre2">
     <w:name w:val="heading 2"/>
     <w:basedOn w:val="Normal"/>
     <w:next w:val="Normal"/>
-    <w:link w:val="Heading2Char"/>
+    <w:link w:val="Titre2Car"/>
     <w:uiPriority w:val="9"/>
     <w:unhideWhenUsed/>
     <w:qFormat/>
@@ -2125,11 +2850,11 @@
       <w:szCs w:val="32"/>
     </w:rPr>
   </w:style>
-  <w:style w:type="paragraph" w:styleId="Heading3">
+  <w:style w:type="paragraph" w:styleId="Titre3">
     <w:name w:val="heading 3"/>
     <w:basedOn w:val="Normal"/>
     <w:next w:val="Normal"/>
-    <w:link w:val="Heading3Char"/>
+    <w:link w:val="Titre3Car"/>
     <w:uiPriority w:val="9"/>
     <w:unhideWhenUsed/>
     <w:qFormat/>
@@ -2147,11 +2872,11 @@
       <w:szCs w:val="28"/>
     </w:rPr>
   </w:style>
-  <w:style w:type="paragraph" w:styleId="Heading4">
+  <w:style w:type="paragraph" w:styleId="Titre4">
     <w:name w:val="heading 4"/>
     <w:basedOn w:val="Normal"/>
     <w:next w:val="Normal"/>
-    <w:link w:val="Heading4Char"/>
+    <w:link w:val="Titre4Car"/>
     <w:uiPriority w:val="9"/>
     <w:semiHidden/>
     <w:unhideWhenUsed/>
@@ -2170,11 +2895,11 @@
       <w:color w:val="0F4761" w:themeColor="accent1" w:themeShade="BF"/>
     </w:rPr>
   </w:style>
-  <w:style w:type="paragraph" w:styleId="Heading5">
+  <w:style w:type="paragraph" w:styleId="Titre5">
     <w:name w:val="heading 5"/>
     <w:basedOn w:val="Normal"/>
     <w:next w:val="Normal"/>
-    <w:link w:val="Heading5Char"/>
+    <w:link w:val="Titre5Car"/>
     <w:uiPriority w:val="9"/>
     <w:semiHidden/>
     <w:unhideWhenUsed/>
@@ -2191,11 +2916,11 @@
       <w:color w:val="0F4761" w:themeColor="accent1" w:themeShade="BF"/>
     </w:rPr>
   </w:style>
-  <w:style w:type="paragraph" w:styleId="Heading6">
+  <w:style w:type="paragraph" w:styleId="Titre6">
     <w:name w:val="heading 6"/>
     <w:basedOn w:val="Normal"/>
     <w:next w:val="Normal"/>
-    <w:link w:val="Heading6Char"/>
+    <w:link w:val="Titre6Car"/>
     <w:uiPriority w:val="9"/>
     <w:semiHidden/>
     <w:unhideWhenUsed/>
@@ -2214,11 +2939,11 @@
       <w:color w:val="595959" w:themeColor="text1" w:themeTint="A6"/>
     </w:rPr>
   </w:style>
-  <w:style w:type="paragraph" w:styleId="Heading7">
+  <w:style w:type="paragraph" w:styleId="Titre7">
     <w:name w:val="heading 7"/>
     <w:basedOn w:val="Normal"/>
     <w:next w:val="Normal"/>
-    <w:link w:val="Heading7Char"/>
+    <w:link w:val="Titre7Car"/>
     <w:uiPriority w:val="9"/>
     <w:semiHidden/>
     <w:unhideWhenUsed/>
@@ -2235,11 +2960,11 @@
       <w:color w:val="595959" w:themeColor="text1" w:themeTint="A6"/>
     </w:rPr>
   </w:style>
-  <w:style w:type="paragraph" w:styleId="Heading8">
+  <w:style w:type="paragraph" w:styleId="Titre8">
     <w:name w:val="heading 8"/>
     <w:basedOn w:val="Normal"/>
     <w:next w:val="Normal"/>
-    <w:link w:val="Heading8Char"/>
+    <w:link w:val="Titre8Car"/>
     <w:uiPriority w:val="9"/>
     <w:semiHidden/>
     <w:unhideWhenUsed/>
@@ -2258,11 +2983,11 @@
       <w:color w:val="272727" w:themeColor="text1" w:themeTint="D8"/>
     </w:rPr>
   </w:style>
-  <w:style w:type="paragraph" w:styleId="Heading9">
+  <w:style w:type="paragraph" w:styleId="Titre9">
     <w:name w:val="heading 9"/>
     <w:basedOn w:val="Normal"/>
     <w:next w:val="Normal"/>
-    <w:link w:val="Heading9Char"/>
+    <w:link w:val="Titre9Car"/>
     <w:uiPriority w:val="9"/>
     <w:semiHidden/>
     <w:unhideWhenUsed/>
@@ -2279,12 +3004,13 @@
       <w:color w:val="272727" w:themeColor="text1" w:themeTint="D8"/>
     </w:rPr>
   </w:style>
-  <w:style w:type="character" w:default="1" w:styleId="DefaultParagraphFont">
+  <w:style w:type="character" w:default="1" w:styleId="Policepardfaut">
     <w:name w:val="Default Paragraph Font"/>
     <w:uiPriority w:val="1"/>
+    <w:semiHidden/>
     <w:unhideWhenUsed/>
   </w:style>
-  <w:style w:type="table" w:default="1" w:styleId="TableNormal">
+  <w:style w:type="table" w:default="1" w:styleId="TableauNormal">
     <w:name w:val="Normal Table"/>
     <w:uiPriority w:val="99"/>
     <w:semiHidden/>
@@ -2299,16 +3025,16 @@
       </w:tblCellMar>
     </w:tblPr>
   </w:style>
-  <w:style w:type="numbering" w:default="1" w:styleId="NoList">
+  <w:style w:type="numbering" w:default="1" w:styleId="Aucuneliste">
     <w:name w:val="No List"/>
     <w:uiPriority w:val="99"/>
     <w:semiHidden/>
     <w:unhideWhenUsed/>
   </w:style>
-  <w:style w:type="character" w:customStyle="1" w:styleId="Heading1Char">
-    <w:name w:val="Heading 1 Char"/>
-    <w:basedOn w:val="DefaultParagraphFont"/>
-    <w:link w:val="Heading1"/>
+  <w:style w:type="character" w:customStyle="1" w:styleId="Titre1Car">
+    <w:name w:val="Titre 1 Car"/>
+    <w:basedOn w:val="Policepardfaut"/>
+    <w:link w:val="Titre1"/>
     <w:uiPriority w:val="9"/>
     <w:rsid w:val="00A9640A"/>
     <w:rPr>
@@ -2319,10 +3045,10 @@
       <w:lang w:val="fr-CA"/>
     </w:rPr>
   </w:style>
-  <w:style w:type="character" w:customStyle="1" w:styleId="Heading2Char">
-    <w:name w:val="Heading 2 Char"/>
-    <w:basedOn w:val="DefaultParagraphFont"/>
-    <w:link w:val="Heading2"/>
+  <w:style w:type="character" w:customStyle="1" w:styleId="Titre2Car">
+    <w:name w:val="Titre 2 Car"/>
+    <w:basedOn w:val="Policepardfaut"/>
+    <w:link w:val="Titre2"/>
     <w:uiPriority w:val="9"/>
     <w:rsid w:val="00A9640A"/>
     <w:rPr>
@@ -2333,10 +3059,10 @@
       <w:lang w:val="fr-CA"/>
     </w:rPr>
   </w:style>
-  <w:style w:type="character" w:customStyle="1" w:styleId="Heading3Char">
-    <w:name w:val="Heading 3 Char"/>
-    <w:basedOn w:val="DefaultParagraphFont"/>
-    <w:link w:val="Heading3"/>
+  <w:style w:type="character" w:customStyle="1" w:styleId="Titre3Car">
+    <w:name w:val="Titre 3 Car"/>
+    <w:basedOn w:val="Policepardfaut"/>
+    <w:link w:val="Titre3"/>
     <w:uiPriority w:val="9"/>
     <w:rsid w:val="00A9640A"/>
     <w:rPr>
@@ -2347,10 +3073,10 @@
       <w:lang w:val="fr-CA"/>
     </w:rPr>
   </w:style>
-  <w:style w:type="character" w:customStyle="1" w:styleId="Heading4Char">
-    <w:name w:val="Heading 4 Char"/>
-    <w:basedOn w:val="DefaultParagraphFont"/>
-    <w:link w:val="Heading4"/>
+  <w:style w:type="character" w:customStyle="1" w:styleId="Titre4Car">
+    <w:name w:val="Titre 4 Car"/>
+    <w:basedOn w:val="Policepardfaut"/>
+    <w:link w:val="Titre4"/>
     <w:uiPriority w:val="9"/>
     <w:semiHidden/>
     <w:rsid w:val="00A9640A"/>
@@ -2362,10 +3088,10 @@
       <w:lang w:val="fr-CA"/>
     </w:rPr>
   </w:style>
-  <w:style w:type="character" w:customStyle="1" w:styleId="Heading5Char">
-    <w:name w:val="Heading 5 Char"/>
-    <w:basedOn w:val="DefaultParagraphFont"/>
-    <w:link w:val="Heading5"/>
+  <w:style w:type="character" w:customStyle="1" w:styleId="Titre5Car">
+    <w:name w:val="Titre 5 Car"/>
+    <w:basedOn w:val="Policepardfaut"/>
+    <w:link w:val="Titre5"/>
     <w:uiPriority w:val="9"/>
     <w:semiHidden/>
     <w:rsid w:val="00A9640A"/>
@@ -2375,10 +3101,10 @@
       <w:lang w:val="fr-CA"/>
     </w:rPr>
   </w:style>
-  <w:style w:type="character" w:customStyle="1" w:styleId="Heading6Char">
-    <w:name w:val="Heading 6 Char"/>
-    <w:basedOn w:val="DefaultParagraphFont"/>
-    <w:link w:val="Heading6"/>
+  <w:style w:type="character" w:customStyle="1" w:styleId="Titre6Car">
+    <w:name w:val="Titre 6 Car"/>
+    <w:basedOn w:val="Policepardfaut"/>
+    <w:link w:val="Titre6"/>
     <w:uiPriority w:val="9"/>
     <w:semiHidden/>
     <w:rsid w:val="00A9640A"/>
@@ -2390,10 +3116,10 @@
       <w:lang w:val="fr-CA"/>
     </w:rPr>
   </w:style>
-  <w:style w:type="character" w:customStyle="1" w:styleId="Heading7Char">
-    <w:name w:val="Heading 7 Char"/>
-    <w:basedOn w:val="DefaultParagraphFont"/>
-    <w:link w:val="Heading7"/>
+  <w:style w:type="character" w:customStyle="1" w:styleId="Titre7Car">
+    <w:name w:val="Titre 7 Car"/>
+    <w:basedOn w:val="Policepardfaut"/>
+    <w:link w:val="Titre7"/>
     <w:uiPriority w:val="9"/>
     <w:semiHidden/>
     <w:rsid w:val="00A9640A"/>
@@ -2403,10 +3129,10 @@
       <w:lang w:val="fr-CA"/>
     </w:rPr>
   </w:style>
-  <w:style w:type="character" w:customStyle="1" w:styleId="Heading8Char">
-    <w:name w:val="Heading 8 Char"/>
-    <w:basedOn w:val="DefaultParagraphFont"/>
-    <w:link w:val="Heading8"/>
+  <w:style w:type="character" w:customStyle="1" w:styleId="Titre8Car">
+    <w:name w:val="Titre 8 Car"/>
+    <w:basedOn w:val="Policepardfaut"/>
+    <w:link w:val="Titre8"/>
     <w:uiPriority w:val="9"/>
     <w:semiHidden/>
     <w:rsid w:val="00A9640A"/>
@@ -2418,10 +3144,10 @@
       <w:lang w:val="fr-CA"/>
     </w:rPr>
   </w:style>
-  <w:style w:type="character" w:customStyle="1" w:styleId="Heading9Char">
-    <w:name w:val="Heading 9 Char"/>
-    <w:basedOn w:val="DefaultParagraphFont"/>
-    <w:link w:val="Heading9"/>
+  <w:style w:type="character" w:customStyle="1" w:styleId="Titre9Car">
+    <w:name w:val="Titre 9 Car"/>
+    <w:basedOn w:val="Policepardfaut"/>
+    <w:link w:val="Titre9"/>
     <w:uiPriority w:val="9"/>
     <w:semiHidden/>
     <w:rsid w:val="00A9640A"/>
@@ -2431,11 +3157,11 @@
       <w:lang w:val="fr-CA"/>
     </w:rPr>
   </w:style>
-  <w:style w:type="paragraph" w:styleId="Title">
+  <w:style w:type="paragraph" w:styleId="Titre">
     <w:name w:val="Title"/>
     <w:basedOn w:val="Normal"/>
     <w:next w:val="Normal"/>
-    <w:link w:val="TitleChar"/>
+    <w:link w:val="TitreCar"/>
     <w:uiPriority w:val="10"/>
     <w:qFormat/>
     <w:rsid w:val="00A9640A"/>
@@ -2451,10 +3177,10 @@
       <w:szCs w:val="56"/>
     </w:rPr>
   </w:style>
-  <w:style w:type="character" w:customStyle="1" w:styleId="TitleChar">
-    <w:name w:val="Title Char"/>
-    <w:basedOn w:val="DefaultParagraphFont"/>
-    <w:link w:val="Title"/>
+  <w:style w:type="character" w:customStyle="1" w:styleId="TitreCar">
+    <w:name w:val="Titre Car"/>
+    <w:basedOn w:val="Policepardfaut"/>
+    <w:link w:val="Titre"/>
     <w:uiPriority w:val="10"/>
     <w:rsid w:val="00A9640A"/>
     <w:rPr>
@@ -2466,11 +3192,11 @@
       <w:lang w:val="fr-CA"/>
     </w:rPr>
   </w:style>
-  <w:style w:type="paragraph" w:styleId="Subtitle">
+  <w:style w:type="paragraph" w:styleId="Sous-titre">
     <w:name w:val="Subtitle"/>
     <w:basedOn w:val="Normal"/>
     <w:next w:val="Normal"/>
-    <w:link w:val="SubtitleChar"/>
+    <w:link w:val="Sous-titreCar"/>
     <w:uiPriority w:val="11"/>
     <w:qFormat/>
     <w:rsid w:val="00A9640A"/>
@@ -2487,10 +3213,10 @@
       <w:szCs w:val="28"/>
     </w:rPr>
   </w:style>
-  <w:style w:type="character" w:customStyle="1" w:styleId="SubtitleChar">
-    <w:name w:val="Subtitle Char"/>
-    <w:basedOn w:val="DefaultParagraphFont"/>
-    <w:link w:val="Subtitle"/>
+  <w:style w:type="character" w:customStyle="1" w:styleId="Sous-titreCar">
+    <w:name w:val="Sous-titre Car"/>
+    <w:basedOn w:val="Policepardfaut"/>
+    <w:link w:val="Sous-titre"/>
     <w:uiPriority w:val="11"/>
     <w:rsid w:val="00A9640A"/>
     <w:rPr>
@@ -2502,11 +3228,11 @@
       <w:lang w:val="fr-CA"/>
     </w:rPr>
   </w:style>
-  <w:style w:type="paragraph" w:styleId="Quote">
+  <w:style w:type="paragraph" w:styleId="Citation">
     <w:name w:val="Quote"/>
     <w:basedOn w:val="Normal"/>
     <w:next w:val="Normal"/>
-    <w:link w:val="QuoteChar"/>
+    <w:link w:val="CitationCar"/>
     <w:uiPriority w:val="29"/>
     <w:qFormat/>
     <w:rsid w:val="00A9640A"/>
@@ -2520,10 +3246,10 @@
       <w:color w:val="404040" w:themeColor="text1" w:themeTint="BF"/>
     </w:rPr>
   </w:style>
-  <w:style w:type="character" w:customStyle="1" w:styleId="QuoteChar">
-    <w:name w:val="Quote Char"/>
-    <w:basedOn w:val="DefaultParagraphFont"/>
-    <w:link w:val="Quote"/>
+  <w:style w:type="character" w:customStyle="1" w:styleId="CitationCar">
+    <w:name w:val="Citation Car"/>
+    <w:basedOn w:val="Policepardfaut"/>
+    <w:link w:val="Citation"/>
     <w:uiPriority w:val="29"/>
     <w:rsid w:val="00A9640A"/>
     <w:rPr>
@@ -2533,7 +3259,7 @@
       <w:lang w:val="fr-CA"/>
     </w:rPr>
   </w:style>
-  <w:style w:type="paragraph" w:styleId="ListParagraph">
+  <w:style w:type="paragraph" w:styleId="Paragraphedeliste">
     <w:name w:val="List Paragraph"/>
     <w:basedOn w:val="Normal"/>
     <w:uiPriority w:val="34"/>
@@ -2544,9 +3270,9 @@
       <w:contextualSpacing/>
     </w:pPr>
   </w:style>
-  <w:style w:type="character" w:styleId="IntenseEmphasis">
+  <w:style w:type="character" w:styleId="Accentuationintense">
     <w:name w:val="Intense Emphasis"/>
-    <w:basedOn w:val="DefaultParagraphFont"/>
+    <w:basedOn w:val="Policepardfaut"/>
     <w:uiPriority w:val="21"/>
     <w:qFormat/>
     <w:rsid w:val="00A9640A"/>
@@ -2556,11 +3282,11 @@
       <w:color w:val="0F4761" w:themeColor="accent1" w:themeShade="BF"/>
     </w:rPr>
   </w:style>
-  <w:style w:type="paragraph" w:styleId="IntenseQuote">
+  <w:style w:type="paragraph" w:styleId="Citationintense">
     <w:name w:val="Intense Quote"/>
     <w:basedOn w:val="Normal"/>
     <w:next w:val="Normal"/>
-    <w:link w:val="IntenseQuoteChar"/>
+    <w:link w:val="CitationintenseCar"/>
     <w:uiPriority w:val="30"/>
     <w:qFormat/>
     <w:rsid w:val="00A9640A"/>
@@ -2579,10 +3305,10 @@
       <w:color w:val="0F4761" w:themeColor="accent1" w:themeShade="BF"/>
     </w:rPr>
   </w:style>
-  <w:style w:type="character" w:customStyle="1" w:styleId="IntenseQuoteChar">
-    <w:name w:val="Intense Quote Char"/>
-    <w:basedOn w:val="DefaultParagraphFont"/>
-    <w:link w:val="IntenseQuote"/>
+  <w:style w:type="character" w:customStyle="1" w:styleId="CitationintenseCar">
+    <w:name w:val="Citation intense Car"/>
+    <w:basedOn w:val="Policepardfaut"/>
+    <w:link w:val="Citationintense"/>
     <w:uiPriority w:val="30"/>
     <w:rsid w:val="00A9640A"/>
     <w:rPr>
@@ -2592,9 +3318,9 @@
       <w:lang w:val="fr-CA"/>
     </w:rPr>
   </w:style>
-  <w:style w:type="character" w:styleId="IntenseReference">
+  <w:style w:type="character" w:styleId="Rfrenceintense">
     <w:name w:val="Intense Reference"/>
-    <w:basedOn w:val="DefaultParagraphFont"/>
+    <w:basedOn w:val="Policepardfaut"/>
     <w:uiPriority w:val="32"/>
     <w:qFormat/>
     <w:rsid w:val="00A9640A"/>
@@ -2606,9 +3332,9 @@
       <w:spacing w:val="5"/>
     </w:rPr>
   </w:style>
-  <w:style w:type="character" w:styleId="Emphasis">
+  <w:style w:type="character" w:styleId="Accentuation">
     <w:name w:val="Emphasis"/>
-    <w:basedOn w:val="DefaultParagraphFont"/>
+    <w:basedOn w:val="Policepardfaut"/>
     <w:uiPriority w:val="20"/>
     <w:qFormat/>
     <w:rsid w:val="00E965CD"/>
@@ -2617,9 +3343,9 @@
       <w:iCs/>
     </w:rPr>
   </w:style>
-  <w:style w:type="character" w:styleId="Hyperlink">
+  <w:style w:type="character" w:styleId="Lienhypertexte">
     <w:name w:val="Hyperlink"/>
-    <w:basedOn w:val="DefaultParagraphFont"/>
+    <w:basedOn w:val="Policepardfaut"/>
     <w:uiPriority w:val="99"/>
     <w:unhideWhenUsed/>
     <w:rsid w:val="007155B2"/>
@@ -2628,9 +3354,9 @@
       <w:u w:val="single"/>
     </w:rPr>
   </w:style>
-  <w:style w:type="character" w:styleId="UnresolvedMention">
+  <w:style w:type="character" w:styleId="Mentionnonrsolue">
     <w:name w:val="Unresolved Mention"/>
-    <w:basedOn w:val="DefaultParagraphFont"/>
+    <w:basedOn w:val="Policepardfaut"/>
     <w:uiPriority w:val="99"/>
     <w:semiHidden/>
     <w:unhideWhenUsed/>
@@ -2959,6 +3685,21 @@
 </file>
 
 <file path=customXml/item1.xml><?xml version="1.0" encoding="utf-8"?>
+<p:properties xmlns:p="http://schemas.microsoft.com/office/2006/metadata/properties" xmlns:xsi="http://www.w3.org/2001/XMLSchema-instance" xmlns:pc="http://schemas.microsoft.com/office/infopath/2007/PartnerControls">
+  <documentManagement/>
+</p:properties>
+</file>
+
+<file path=customXml/item2.xml><?xml version="1.0" encoding="utf-8"?>
+<?mso-contentType ?>
+<FormTemplates xmlns="http://schemas.microsoft.com/sharepoint/v3/contenttype/forms">
+  <Display>DocumentLibraryForm</Display>
+  <Edit>DocumentLibraryForm</Edit>
+  <New>DocumentLibraryForm</New>
+</FormTemplates>
+</file>
+
+<file path=customXml/item3.xml><?xml version="1.0" encoding="utf-8"?>
 <ct:contentTypeSchema xmlns:ct="http://schemas.microsoft.com/office/2006/metadata/contentType" xmlns:ma="http://schemas.microsoft.com/office/2006/metadata/properties/metaAttributes" ct:_="" ma:_="" ma:contentTypeName="Document" ma:contentTypeID="0x010100B537D9CBF3A81D42A7781564E1C4B118" ma:contentTypeVersion="3" ma:contentTypeDescription="Crée un document." ma:contentTypeScope="" ma:versionID="ad8e0ebe14b96894426a6ebf504a5a97">
   <xsd:schema xmlns:xsd="http://www.w3.org/2001/XMLSchema" xmlns:xs="http://www.w3.org/2001/XMLSchema" xmlns:p="http://schemas.microsoft.com/office/2006/metadata/properties" xmlns:ns2="1256c6ae-50a3-4b3f-a741-966f546b47e8" targetNamespace="http://schemas.microsoft.com/office/2006/metadata/properties" ma:root="true" ma:fieldsID="f1ecc96f702649f69a444d67ff7c73fa" ns2:_="">
     <xsd:import namespace="1256c6ae-50a3-4b3f-a741-966f546b47e8"/>
@@ -3096,29 +3837,37 @@
 </ct:contentTypeSchema>
 </file>
 
-<file path=customXml/item2.xml><?xml version="1.0" encoding="utf-8"?>
-<?mso-contentType ?>
-<FormTemplates xmlns="http://schemas.microsoft.com/sharepoint/v3/contenttype/forms">
-  <Display>DocumentLibraryForm</Display>
-  <Edit>DocumentLibraryForm</Edit>
-  <New>DocumentLibraryForm</New>
-</FormTemplates>
-</file>
-
-<file path=customXml/item3.xml><?xml version="1.0" encoding="utf-8"?>
-<p:properties xmlns:p="http://schemas.microsoft.com/office/2006/metadata/properties" xmlns:xsi="http://www.w3.org/2001/XMLSchema-instance" xmlns:pc="http://schemas.microsoft.com/office/infopath/2007/PartnerControls">
-  <documentManagement/>
-</p:properties>
-</file>
-
 <file path=customXml/itemProps1.xml><?xml version="1.0" encoding="utf-8"?>
-<ds:datastoreItem xmlns:ds="http://schemas.openxmlformats.org/officeDocument/2006/customXml" ds:itemID="{584D6599-AA16-4EA9-BF36-A942F2A35E94}"/>
+<ds:datastoreItem xmlns:ds="http://schemas.openxmlformats.org/officeDocument/2006/customXml" ds:itemID="{0879AD43-6500-4156-A521-11C4987015EC}">
+  <ds:schemaRefs>
+    <ds:schemaRef ds:uri="http://schemas.microsoft.com/office/2006/metadata/properties"/>
+    <ds:schemaRef ds:uri="http://schemas.microsoft.com/office/infopath/2007/PartnerControls"/>
+  </ds:schemaRefs>
+</ds:datastoreItem>
 </file>
 
 <file path=customXml/itemProps2.xml><?xml version="1.0" encoding="utf-8"?>
-<ds:datastoreItem xmlns:ds="http://schemas.openxmlformats.org/officeDocument/2006/customXml" ds:itemID="{C363C405-5F69-494A-9EC9-42981894C99C}"/>
+<ds:datastoreItem xmlns:ds="http://schemas.openxmlformats.org/officeDocument/2006/customXml" ds:itemID="{C363C405-5F69-494A-9EC9-42981894C99C}">
+  <ds:schemaRefs>
+    <ds:schemaRef ds:uri="http://schemas.microsoft.com/sharepoint/v3/contenttype/forms"/>
+  </ds:schemaRefs>
+</ds:datastoreItem>
 </file>
 
 <file path=customXml/itemProps3.xml><?xml version="1.0" encoding="utf-8"?>
-<ds:datastoreItem xmlns:ds="http://schemas.openxmlformats.org/officeDocument/2006/customXml" ds:itemID="{0879AD43-6500-4156-A521-11C4987015EC}"/>
+<ds:datastoreItem xmlns:ds="http://schemas.openxmlformats.org/officeDocument/2006/customXml" ds:itemID="{584D6599-AA16-4EA9-BF36-A942F2A35E94}">
+  <ds:schemaRefs>
+    <ds:schemaRef ds:uri="http://schemas.microsoft.com/office/2006/metadata/contentType"/>
+    <ds:schemaRef ds:uri="http://schemas.microsoft.com/office/2006/metadata/properties/metaAttributes"/>
+    <ds:schemaRef ds:uri="http://www.w3.org/2001/XMLSchema"/>
+    <ds:schemaRef ds:uri="http://schemas.microsoft.com/office/2006/metadata/properties"/>
+    <ds:schemaRef ds:uri="1256c6ae-50a3-4b3f-a741-966f546b47e8"/>
+    <ds:schemaRef ds:uri="http://schemas.microsoft.com/office/2006/documentManagement/types"/>
+    <ds:schemaRef ds:uri="http://schemas.microsoft.com/office/infopath/2007/PartnerControls"/>
+    <ds:schemaRef ds:uri="http://schemas.openxmlformats.org/package/2006/metadata/core-properties"/>
+    <ds:schemaRef ds:uri="http://purl.org/dc/elements/1.1/"/>
+    <ds:schemaRef ds:uri="http://purl.org/dc/terms/"/>
+    <ds:schemaRef ds:uri="http://schemas.microsoft.com/internal/obd"/>
+  </ds:schemaRefs>
+</ds:datastoreItem>
 </file>
</xml_diff>

<commit_message>
Modification du fichier en base de données
</commit_message>
<xml_diff>
--- a/BASE_DE_DONNEES_RELATIONNELLE/Cours13/Cours13_Revision.docx
+++ b/BASE_DE_DONNEES_RELATIONNELLE/Cours13/Cours13_Revision.docx
@@ -104,6 +104,7 @@
       <w:r>
         <w:rPr>
           <w:rFonts w:ascii="Calibri" w:hAnsi="Calibri" w:cs="Calibri"/>
+          <w:noProof/>
           <w:lang w:val="fr-FR"/>
         </w:rPr>
         <w:drawing>
@@ -175,23 +176,7 @@
           <w:rFonts w:ascii="Calibri" w:hAnsi="Calibri" w:cs="Calibri"/>
           <w:lang w:val="fr-FR"/>
         </w:rPr>
-        <w:t xml:space="preserve"> dans le </w:t>
-      </w:r>
-      <w:proofErr w:type="spellStart"/>
-      <w:r>
-        <w:rPr>
-          <w:rFonts w:ascii="Calibri" w:hAnsi="Calibri" w:cs="Calibri"/>
-          <w:lang w:val="fr-FR"/>
-        </w:rPr>
-        <w:t>Pokédex</w:t>
-      </w:r>
-      <w:proofErr w:type="spellEnd"/>
-      <w:r>
-        <w:rPr>
-          <w:rFonts w:ascii="Calibri" w:hAnsi="Calibri" w:cs="Calibri"/>
-          <w:lang w:val="fr-FR"/>
-        </w:rPr>
-        <w:t>. Triez cette liste du plus grand au plus petit.</w:t>
+        <w:t xml:space="preserve"> dans le Pokédex. Triez cette liste du plus grand au plus petit.</w:t>
       </w:r>
     </w:p>
     <w:p>
@@ -206,6 +191,7 @@
       <w:r>
         <w:rPr>
           <w:rFonts w:ascii="Calibri" w:hAnsi="Calibri" w:cs="Calibri"/>
+          <w:noProof/>
           <w:lang w:val="fr-FR"/>
         </w:rPr>
         <w:drawing>
@@ -278,6 +264,7 @@
       <w:r>
         <w:rPr>
           <w:rFonts w:ascii="Calibri" w:hAnsi="Calibri" w:cs="Calibri"/>
+          <w:noProof/>
           <w:lang w:val="fr-FR"/>
         </w:rPr>
         <w:drawing>
@@ -364,6 +351,7 @@
       <w:r>
         <w:rPr>
           <w:rFonts w:ascii="Calibri" w:hAnsi="Calibri" w:cs="Calibri"/>
+          <w:noProof/>
           <w:lang w:val="fr-FR"/>
         </w:rPr>
         <w:drawing>
@@ -423,15 +411,20 @@
         </w:rPr>
         <w:t xml:space="preserve">Sortez la liste des lieux de rencontre dont les dresseurs ont capturé le plus des Pokémon dont le type de </w:t>
       </w:r>
-      <w:proofErr w:type="spellStart"/>
-      <w:r>
-        <w:rPr>
-          <w:rFonts w:ascii="Calibri" w:hAnsi="Calibri" w:cs="Calibri"/>
-          <w:lang w:val="fr-FR"/>
-        </w:rPr>
-        <w:t>tera</w:t>
-      </w:r>
-      <w:proofErr w:type="spellEnd"/>
+      <w:r>
+        <w:rPr>
+          <w:rFonts w:ascii="Calibri" w:hAnsi="Calibri" w:cs="Calibri"/>
+          <w:lang w:val="fr-FR"/>
+        </w:rPr>
+        <w:t xml:space="preserve">tera </w:t>
+      </w:r>
+      <w:r>
+        <w:rPr>
+          <w:rFonts w:ascii="Calibri" w:hAnsi="Calibri" w:cs="Calibri"/>
+          <w:lang w:val="fr-FR"/>
+        </w:rPr>
+        <w:t>est dragon</w:t>
+      </w:r>
       <w:r>
         <w:rPr>
           <w:rFonts w:ascii="Calibri" w:hAnsi="Calibri" w:cs="Calibri"/>
@@ -444,37 +437,7 @@
           <w:rFonts w:ascii="Calibri" w:hAnsi="Calibri" w:cs="Calibri"/>
           <w:lang w:val="fr-FR"/>
         </w:rPr>
-        <w:t>est dragon</w:t>
-      </w:r>
-      <w:r>
-        <w:rPr>
-          <w:rFonts w:ascii="Calibri" w:hAnsi="Calibri" w:cs="Calibri"/>
-          <w:lang w:val="fr-FR"/>
-        </w:rPr>
-        <w:t xml:space="preserve"> </w:t>
-      </w:r>
-      <w:r>
-        <w:rPr>
-          <w:rFonts w:ascii="Calibri" w:hAnsi="Calibri" w:cs="Calibri"/>
-          <w:lang w:val="fr-FR"/>
-        </w:rPr>
-        <w:t>(</w:t>
-      </w:r>
-      <w:proofErr w:type="spellStart"/>
-      <w:r>
-        <w:rPr>
-          <w:rFonts w:ascii="Calibri" w:hAnsi="Calibri" w:cs="Calibri"/>
-          <w:lang w:val="fr-FR"/>
-        </w:rPr>
-        <w:t>tera_type</w:t>
-      </w:r>
-      <w:proofErr w:type="spellEnd"/>
-      <w:r>
-        <w:rPr>
-          <w:rFonts w:ascii="Calibri" w:hAnsi="Calibri" w:cs="Calibri"/>
-          <w:lang w:val="fr-FR"/>
-        </w:rPr>
-        <w:t>)</w:t>
+        <w:t>(tera_type)</w:t>
       </w:r>
       <w:r>
         <w:rPr>
@@ -496,6 +459,7 @@
       <w:r>
         <w:rPr>
           <w:rFonts w:ascii="Calibri" w:hAnsi="Calibri" w:cs="Calibri"/>
+          <w:noProof/>
           <w:lang w:val="fr-FR"/>
         </w:rPr>
         <w:lastRenderedPageBreak/>
@@ -583,6 +547,7 @@
       <w:r>
         <w:rPr>
           <w:rFonts w:ascii="Calibri" w:hAnsi="Calibri" w:cs="Calibri"/>
+          <w:noProof/>
           <w:lang w:val="fr-FR"/>
         </w:rPr>
         <w:drawing>
@@ -656,23 +621,7 @@
           <w:rFonts w:ascii="Calibri" w:hAnsi="Calibri" w:cs="Calibri"/>
           <w:lang w:val="fr-FR"/>
         </w:rPr>
-        <w:t>des Pokémon « </w:t>
-      </w:r>
-      <w:proofErr w:type="spellStart"/>
-      <w:r>
-        <w:rPr>
-          <w:rFonts w:ascii="Calibri" w:hAnsi="Calibri" w:cs="Calibri"/>
-          <w:lang w:val="fr-FR"/>
-        </w:rPr>
-        <w:t>shiny</w:t>
-      </w:r>
-      <w:proofErr w:type="spellEnd"/>
-      <w:r>
-        <w:rPr>
-          <w:rFonts w:ascii="Calibri" w:hAnsi="Calibri" w:cs="Calibri"/>
-          <w:lang w:val="fr-FR"/>
-        </w:rPr>
-        <w:t> » qui date</w:t>
+        <w:t>des Pokémon « shiny » qui date</w:t>
       </w:r>
       <w:r>
         <w:rPr>
@@ -701,6 +650,7 @@
       <w:r>
         <w:rPr>
           <w:rFonts w:ascii="Calibri" w:hAnsi="Calibri" w:cs="Calibri"/>
+          <w:noProof/>
           <w:lang w:val="fr-FR"/>
         </w:rPr>
         <w:drawing>
@@ -758,17 +708,8 @@
           <w:rFonts w:ascii="Calibri" w:hAnsi="Calibri" w:cs="Calibri"/>
           <w:lang w:val="fr-FR"/>
         </w:rPr>
-        <w:t xml:space="preserve">Sortez la liste des 25 premier Pokémon du </w:t>
-      </w:r>
-      <w:proofErr w:type="spellStart"/>
-      <w:r>
-        <w:rPr>
-          <w:rFonts w:ascii="Calibri" w:hAnsi="Calibri" w:cs="Calibri"/>
-          <w:lang w:val="fr-FR"/>
-        </w:rPr>
-        <w:t>Pokédex</w:t>
-      </w:r>
-      <w:proofErr w:type="spellEnd"/>
+        <w:t>Sortez la liste des 25 premier Pokémon du Pokédex</w:t>
+      </w:r>
       <w:r>
         <w:rPr>
           <w:rFonts w:ascii="Calibri" w:hAnsi="Calibri" w:cs="Calibri"/>
@@ -789,6 +730,7 @@
       <w:r>
         <w:rPr>
           <w:rFonts w:ascii="Calibri" w:hAnsi="Calibri" w:cs="Calibri"/>
+          <w:noProof/>
           <w:lang w:val="fr-FR"/>
         </w:rPr>
         <w:drawing>
@@ -925,23 +867,7 @@
           <w:rFonts w:ascii="Calibri" w:hAnsi="Calibri" w:cs="Calibri"/>
           <w:lang w:val="fr-FR"/>
         </w:rPr>
-        <w:t xml:space="preserve"> « </w:t>
-      </w:r>
-      <w:proofErr w:type="spellStart"/>
-      <w:r>
-        <w:rPr>
-          <w:rFonts w:ascii="Calibri" w:hAnsi="Calibri" w:cs="Calibri"/>
-          <w:lang w:val="fr-FR"/>
-        </w:rPr>
-        <w:t>shiny</w:t>
-      </w:r>
-      <w:proofErr w:type="spellEnd"/>
-      <w:r>
-        <w:rPr>
-          <w:rFonts w:ascii="Calibri" w:hAnsi="Calibri" w:cs="Calibri"/>
-          <w:lang w:val="fr-FR"/>
-        </w:rPr>
-        <w:t> »</w:t>
+        <w:t xml:space="preserve"> « shiny »</w:t>
       </w:r>
       <w:r>
         <w:rPr>
@@ -960,6 +886,47 @@
           <w:lang w:val="fr-FR"/>
         </w:rPr>
       </w:pPr>
+      <w:r>
+        <w:rPr>
+          <w:rFonts w:ascii="Calibri" w:hAnsi="Calibri" w:cs="Calibri"/>
+          <w:lang w:val="fr-FR"/>
+        </w:rPr>
+        <w:drawing>
+          <wp:inline distT="0" distB="0" distL="0" distR="0" wp14:anchorId="1B14B8E0" wp14:editId="66BC23B1">
+            <wp:extent cx="5943600" cy="538480"/>
+            <wp:effectExtent l="0" t="0" r="0" b="0"/>
+            <wp:docPr id="1579009562" name="Image 1"/>
+            <wp:cNvGraphicFramePr>
+              <a:graphicFrameLocks xmlns:a="http://schemas.openxmlformats.org/drawingml/2006/main" noChangeAspect="1"/>
+            </wp:cNvGraphicFramePr>
+            <a:graphic xmlns:a="http://schemas.openxmlformats.org/drawingml/2006/main">
+              <a:graphicData uri="http://schemas.openxmlformats.org/drawingml/2006/picture">
+                <pic:pic xmlns:pic="http://schemas.openxmlformats.org/drawingml/2006/picture">
+                  <pic:nvPicPr>
+                    <pic:cNvPr id="1579009562" name=""/>
+                    <pic:cNvPicPr/>
+                  </pic:nvPicPr>
+                  <pic:blipFill>
+                    <a:blip r:embed="rId17"/>
+                    <a:stretch>
+                      <a:fillRect/>
+                    </a:stretch>
+                  </pic:blipFill>
+                  <pic:spPr>
+                    <a:xfrm>
+                      <a:off x="0" y="0"/>
+                      <a:ext cx="5943600" cy="538480"/>
+                    </a:xfrm>
+                    <a:prstGeom prst="rect">
+                      <a:avLst/>
+                    </a:prstGeom>
+                  </pic:spPr>
+                </pic:pic>
+              </a:graphicData>
+            </a:graphic>
+          </wp:inline>
+        </w:drawing>
+      </w:r>
     </w:p>
     <w:p>
       <w:pPr>
@@ -979,23 +946,7 @@
           <w:rFonts w:ascii="Calibri" w:hAnsi="Calibri" w:cs="Calibri"/>
           <w:lang w:val="fr-FR"/>
         </w:rPr>
-        <w:t xml:space="preserve">Dans le </w:t>
-      </w:r>
-      <w:proofErr w:type="spellStart"/>
-      <w:r>
-        <w:rPr>
-          <w:rFonts w:ascii="Calibri" w:hAnsi="Calibri" w:cs="Calibri"/>
-          <w:lang w:val="fr-FR"/>
-        </w:rPr>
-        <w:t>Pokédex</w:t>
-      </w:r>
-      <w:proofErr w:type="spellEnd"/>
-      <w:r>
-        <w:rPr>
-          <w:rFonts w:ascii="Calibri" w:hAnsi="Calibri" w:cs="Calibri"/>
-          <w:lang w:val="fr-FR"/>
-        </w:rPr>
-        <w:t xml:space="preserve">, trouvez </w:t>
+        <w:t xml:space="preserve">Dans le Pokédex, trouvez </w:t>
       </w:r>
       <w:r>
         <w:rPr>
@@ -1009,23 +960,7 @@
           <w:rFonts w:ascii="Calibri" w:hAnsi="Calibri" w:cs="Calibri"/>
           <w:lang w:val="fr-FR"/>
         </w:rPr>
-        <w:t xml:space="preserve">, n’oubliez pas de renommer les colonnes, les 18 </w:t>
-      </w:r>
-      <w:proofErr w:type="spellStart"/>
-      <w:r>
-        <w:rPr>
-          <w:rFonts w:ascii="Calibri" w:hAnsi="Calibri" w:cs="Calibri"/>
-          <w:lang w:val="fr-FR"/>
-        </w:rPr>
-        <w:t>hahaha</w:t>
-      </w:r>
-      <w:proofErr w:type="spellEnd"/>
-      <w:r>
-        <w:rPr>
-          <w:rFonts w:ascii="Calibri" w:hAnsi="Calibri" w:cs="Calibri"/>
-          <w:lang w:val="fr-FR"/>
-        </w:rPr>
-        <w:t>.</w:t>
+        <w:t>, n’oubliez pas de renommer les colonnes, les 18 hahaha.</w:t>
       </w:r>
     </w:p>
     <w:p>
@@ -1090,23 +1025,7 @@
           <w:rFonts w:ascii="Calibri" w:hAnsi="Calibri" w:cs="Calibri"/>
           <w:lang w:val="fr-FR"/>
         </w:rPr>
-        <w:t xml:space="preserve">Pokémon dans le </w:t>
-      </w:r>
-      <w:proofErr w:type="spellStart"/>
-      <w:r>
-        <w:rPr>
-          <w:rFonts w:ascii="Calibri" w:hAnsi="Calibri" w:cs="Calibri"/>
-          <w:lang w:val="fr-FR"/>
-        </w:rPr>
-        <w:t>Pokédex</w:t>
-      </w:r>
-      <w:proofErr w:type="spellEnd"/>
-      <w:r>
-        <w:rPr>
-          <w:rFonts w:ascii="Calibri" w:hAnsi="Calibri" w:cs="Calibri"/>
-          <w:lang w:val="fr-FR"/>
-        </w:rPr>
-        <w:t xml:space="preserve"> qui</w:t>
+        <w:t>Pokémon dans le Pokédex qui</w:t>
       </w:r>
       <w:r>
         <w:rPr>
@@ -1165,7 +1084,7 @@
                     <pic:cNvPicPr/>
                   </pic:nvPicPr>
                   <pic:blipFill>
-                    <a:blip r:embed="rId17"/>
+                    <a:blip r:embed="rId18"/>
                     <a:stretch>
                       <a:fillRect/>
                     </a:stretch>
@@ -1204,78 +1123,14 @@
           <w:rFonts w:ascii="Calibri" w:hAnsi="Calibri" w:cs="Calibri"/>
           <w:lang w:val="fr-FR"/>
         </w:rPr>
-        <w:t xml:space="preserve">On cherche pour une équipe compétitive des Pokémon (du </w:t>
-      </w:r>
-      <w:proofErr w:type="spellStart"/>
-      <w:r>
-        <w:rPr>
-          <w:rFonts w:ascii="Calibri" w:hAnsi="Calibri" w:cs="Calibri"/>
-          <w:lang w:val="fr-FR"/>
-        </w:rPr>
-        <w:t>Pokédex</w:t>
-      </w:r>
-      <w:proofErr w:type="spellEnd"/>
-      <w:r>
-        <w:rPr>
-          <w:rFonts w:ascii="Calibri" w:hAnsi="Calibri" w:cs="Calibri"/>
-          <w:lang w:val="fr-FR"/>
-        </w:rPr>
-        <w:t xml:space="preserve">) qui sont rapides et robustes pour une équipe </w:t>
-      </w:r>
-      <w:r>
-        <w:rPr>
-          <w:rFonts w:ascii="Calibri" w:hAnsi="Calibri" w:cs="Calibri"/>
-          <w:lang w:val="fr-FR"/>
-        </w:rPr>
-        <w:t>de style « </w:t>
-      </w:r>
-      <w:proofErr w:type="spellStart"/>
-      <w:r>
-        <w:rPr>
-          <w:rFonts w:ascii="Calibri" w:hAnsi="Calibri" w:cs="Calibri"/>
-          <w:lang w:val="fr-FR"/>
-        </w:rPr>
-        <w:t>Bulky</w:t>
-      </w:r>
-      <w:proofErr w:type="spellEnd"/>
-      <w:r>
-        <w:rPr>
-          <w:rFonts w:ascii="Calibri" w:hAnsi="Calibri" w:cs="Calibri"/>
-          <w:lang w:val="fr-FR"/>
-        </w:rPr>
-        <w:t xml:space="preserve"> Offense ». Voici les </w:t>
-      </w:r>
-      <w:proofErr w:type="spellStart"/>
-      <w:r>
-        <w:rPr>
-          <w:rFonts w:ascii="Calibri" w:hAnsi="Calibri" w:cs="Calibri"/>
-          <w:lang w:val="fr-FR"/>
-        </w:rPr>
-        <w:t>pré-requis</w:t>
-      </w:r>
-      <w:proofErr w:type="spellEnd"/>
-      <w:r>
-        <w:rPr>
-          <w:rFonts w:ascii="Calibri" w:hAnsi="Calibri" w:cs="Calibri"/>
-          <w:lang w:val="fr-FR"/>
-        </w:rPr>
-        <w:t xml:space="preserve">, la vitesse de base doit être supérieure à 90, les </w:t>
-      </w:r>
-      <w:proofErr w:type="spellStart"/>
-      <w:r>
-        <w:rPr>
-          <w:rFonts w:ascii="Calibri" w:hAnsi="Calibri" w:cs="Calibri"/>
-          <w:lang w:val="fr-FR"/>
-        </w:rPr>
-        <w:t>pv</w:t>
-      </w:r>
-      <w:proofErr w:type="spellEnd"/>
-      <w:r>
-        <w:rPr>
-          <w:rFonts w:ascii="Calibri" w:hAnsi="Calibri" w:cs="Calibri"/>
-          <w:lang w:val="fr-FR"/>
-        </w:rPr>
-        <w:t xml:space="preserve"> doivent être supérieurs à 90, le type 1 doit être </w:t>
+        <w:t xml:space="preserve">On cherche pour une équipe compétitive des Pokémon (du Pokédex) qui sont rapides et robustes pour une équipe </w:t>
+      </w:r>
+      <w:r>
+        <w:rPr>
+          <w:rFonts w:ascii="Calibri" w:hAnsi="Calibri" w:cs="Calibri"/>
+          <w:lang w:val="fr-FR"/>
+        </w:rPr>
+        <w:t xml:space="preserve">de style « Bulky Offense ». Voici les pré-requis, la vitesse de base doit être supérieure à 90, les pv doivent être supérieurs à 90, le type 1 doit être </w:t>
       </w:r>
       <w:r>
         <w:rPr>
@@ -1284,7 +1139,6 @@
         </w:rPr>
         <w:t>« </w:t>
       </w:r>
-      <w:proofErr w:type="spellStart"/>
       <w:r>
         <w:rPr>
           <w:rFonts w:ascii="Calibri" w:hAnsi="Calibri" w:cs="Calibri"/>
@@ -1292,29 +1146,12 @@
         </w:rPr>
         <w:t>électrik</w:t>
       </w:r>
-      <w:proofErr w:type="spellEnd"/>
-      <w:r>
-        <w:rPr>
-          <w:rFonts w:ascii="Calibri" w:hAnsi="Calibri" w:cs="Calibri"/>
-          <w:lang w:val="fr-FR"/>
-        </w:rPr>
-        <w:t xml:space="preserve"> » ou « eau » et le numéro dans le </w:t>
-      </w:r>
-      <w:proofErr w:type="spellStart"/>
-      <w:r>
-        <w:rPr>
-          <w:rFonts w:ascii="Calibri" w:hAnsi="Calibri" w:cs="Calibri"/>
-          <w:lang w:val="fr-FR"/>
-        </w:rPr>
-        <w:t>Pokédex</w:t>
-      </w:r>
-      <w:proofErr w:type="spellEnd"/>
-      <w:r>
-        <w:rPr>
-          <w:rFonts w:ascii="Calibri" w:hAnsi="Calibri" w:cs="Calibri"/>
-          <w:lang w:val="fr-FR"/>
-        </w:rPr>
-        <w:t xml:space="preserve"> doit être </w:t>
+      <w:r>
+        <w:rPr>
+          <w:rFonts w:ascii="Calibri" w:hAnsi="Calibri" w:cs="Calibri"/>
+          <w:lang w:val="fr-FR"/>
+        </w:rPr>
+        <w:t xml:space="preserve"> » ou « eau » et le numéro dans le Pokédex doit être </w:t>
       </w:r>
       <w:r>
         <w:rPr>
@@ -1342,23 +1179,7 @@
           <w:rFonts w:ascii="Calibri" w:hAnsi="Calibri" w:cs="Calibri"/>
           <w:lang w:val="fr-FR"/>
         </w:rPr>
-        <w:t xml:space="preserve">Vendredi prochain c’est ENCORE un vendredi 13. Such wow, Much </w:t>
-      </w:r>
-      <w:proofErr w:type="spellStart"/>
-      <w:r>
-        <w:rPr>
-          <w:rFonts w:ascii="Calibri" w:hAnsi="Calibri" w:cs="Calibri"/>
-          <w:lang w:val="fr-FR"/>
-        </w:rPr>
-        <w:t>incredible</w:t>
-      </w:r>
-      <w:proofErr w:type="spellEnd"/>
-      <w:r>
-        <w:rPr>
-          <w:rFonts w:ascii="Calibri" w:hAnsi="Calibri" w:cs="Calibri"/>
-          <w:lang w:val="fr-FR"/>
-        </w:rPr>
-        <w:t> !</w:t>
+        <w:t>Vendredi prochain c’est ENCORE un vendredi 13. Such wow, Much incredible !</w:t>
       </w:r>
     </w:p>
     <w:p>
@@ -1379,39 +1200,14 @@
           <w:rFonts w:ascii="Calibri" w:hAnsi="Calibri" w:cs="Calibri"/>
           <w:lang w:val="fr-FR"/>
         </w:rPr>
-        <w:t xml:space="preserve">Pour notre équipe ultra offensive, on veut les Pokémon du </w:t>
-      </w:r>
-      <w:proofErr w:type="spellStart"/>
-      <w:r>
-        <w:rPr>
-          <w:rFonts w:ascii="Calibri" w:hAnsi="Calibri" w:cs="Calibri"/>
-          <w:lang w:val="fr-FR"/>
-        </w:rPr>
-        <w:t>Pokédex</w:t>
-      </w:r>
-      <w:proofErr w:type="spellEnd"/>
-      <w:r>
-        <w:rPr>
-          <w:rFonts w:ascii="Calibri" w:hAnsi="Calibri" w:cs="Calibri"/>
-          <w:lang w:val="fr-FR"/>
-        </w:rPr>
-        <w:t xml:space="preserve"> qui sont de ce que l’on nomme en anglais « glass </w:t>
-      </w:r>
-      <w:proofErr w:type="spellStart"/>
-      <w:r>
-        <w:rPr>
-          <w:rFonts w:ascii="Calibri" w:hAnsi="Calibri" w:cs="Calibri"/>
-          <w:lang w:val="fr-FR"/>
-        </w:rPr>
-        <w:t>cannon</w:t>
-      </w:r>
-      <w:proofErr w:type="spellEnd"/>
-      <w:r>
-        <w:rPr>
-          <w:rFonts w:ascii="Calibri" w:hAnsi="Calibri" w:cs="Calibri"/>
-          <w:lang w:val="fr-FR"/>
-        </w:rPr>
-        <w:t> ».</w:t>
+        <w:t>Pour notre équipe ultra offensive, on veut les Pokémon du Pokédex</w:t>
+      </w:r>
+      <w:r>
+        <w:rPr>
+          <w:rFonts w:ascii="Calibri" w:hAnsi="Calibri" w:cs="Calibri"/>
+          <w:lang w:val="fr-FR"/>
+        </w:rPr>
+        <w:t xml:space="preserve"> qui sont de ce que l’on nomme en anglais « glass cannon ».</w:t>
       </w:r>
       <w:r>
         <w:rPr>
@@ -1425,46 +1221,14 @@
           <w:rFonts w:ascii="Calibri" w:hAnsi="Calibri" w:cs="Calibri"/>
           <w:lang w:val="fr-FR"/>
         </w:rPr>
-        <w:t>spéciale (</w:t>
-      </w:r>
-      <w:proofErr w:type="spellStart"/>
-      <w:r>
-        <w:rPr>
-          <w:rFonts w:ascii="Calibri" w:hAnsi="Calibri" w:cs="Calibri"/>
-          <w:lang w:val="fr-FR"/>
-        </w:rPr>
-        <w:t>atq_spe</w:t>
-      </w:r>
-      <w:proofErr w:type="spellEnd"/>
-      <w:r>
-        <w:rPr>
-          <w:rFonts w:ascii="Calibri" w:hAnsi="Calibri" w:cs="Calibri"/>
-          <w:lang w:val="fr-FR"/>
-        </w:rPr>
-        <w:t>) est supérieur à 110. La défense ou la</w:t>
-      </w:r>
-      <w:r>
-        <w:rPr>
-          <w:rFonts w:ascii="Calibri" w:hAnsi="Calibri" w:cs="Calibri"/>
-          <w:lang w:val="fr-FR"/>
-        </w:rPr>
-        <w:t xml:space="preserve"> défense spéciale (</w:t>
-      </w:r>
-      <w:proofErr w:type="spellStart"/>
-      <w:r>
-        <w:rPr>
-          <w:rFonts w:ascii="Calibri" w:hAnsi="Calibri" w:cs="Calibri"/>
-          <w:lang w:val="fr-FR"/>
-        </w:rPr>
-        <w:t>def_spe</w:t>
-      </w:r>
-      <w:proofErr w:type="spellEnd"/>
-      <w:r>
-        <w:rPr>
-          <w:rFonts w:ascii="Calibri" w:hAnsi="Calibri" w:cs="Calibri"/>
-          <w:lang w:val="fr-FR"/>
-        </w:rPr>
-        <w:t>) doit être inférieure à 50. Le type_2 ne doit pas être NULL et le nom de l’espèce doit être plus long que 5 caractères !</w:t>
+        <w:t>spéciale (atq_spe) est supérieur à 110. La défense ou la</w:t>
+      </w:r>
+      <w:r>
+        <w:rPr>
+          <w:rFonts w:ascii="Calibri" w:hAnsi="Calibri" w:cs="Calibri"/>
+          <w:lang w:val="fr-FR"/>
+        </w:rPr>
+        <w:t xml:space="preserve"> défense spéciale (def_spe) doit être inférieure à 50. Le type_2 ne doit pas être NULL et le nom de l’espèce doit être plus long que 5 caractères !</w:t>
       </w:r>
     </w:p>
     <w:p>
@@ -1547,7 +1311,7 @@
                     <pic:cNvPicPr/>
                   </pic:nvPicPr>
                   <pic:blipFill>
-                    <a:blip r:embed="rId18"/>
+                    <a:blip r:embed="rId19"/>
                     <a:stretch>
                       <a:fillRect/>
                     </a:stretch>
@@ -3685,18 +3449,18 @@
 </file>
 
 <file path=customXml/item1.xml><?xml version="1.0" encoding="utf-8"?>
-<p:properties xmlns:p="http://schemas.microsoft.com/office/2006/metadata/properties" xmlns:xsi="http://www.w3.org/2001/XMLSchema-instance" xmlns:pc="http://schemas.microsoft.com/office/infopath/2007/PartnerControls">
-  <documentManagement/>
-</p:properties>
-</file>
-
-<file path=customXml/item2.xml><?xml version="1.0" encoding="utf-8"?>
 <?mso-contentType ?>
 <FormTemplates xmlns="http://schemas.microsoft.com/sharepoint/v3/contenttype/forms">
   <Display>DocumentLibraryForm</Display>
   <Edit>DocumentLibraryForm</Edit>
   <New>DocumentLibraryForm</New>
 </FormTemplates>
+</file>
+
+<file path=customXml/item2.xml><?xml version="1.0" encoding="utf-8"?>
+<p:properties xmlns:p="http://schemas.microsoft.com/office/2006/metadata/properties" xmlns:xsi="http://www.w3.org/2001/XMLSchema-instance" xmlns:pc="http://schemas.microsoft.com/office/infopath/2007/PartnerControls">
+  <documentManagement/>
+</p:properties>
 </file>
 
 <file path=customXml/item3.xml><?xml version="1.0" encoding="utf-8"?>
@@ -3838,18 +3602,18 @@
 </file>
 
 <file path=customXml/itemProps1.xml><?xml version="1.0" encoding="utf-8"?>
-<ds:datastoreItem xmlns:ds="http://schemas.openxmlformats.org/officeDocument/2006/customXml" ds:itemID="{0879AD43-6500-4156-A521-11C4987015EC}">
+<ds:datastoreItem xmlns:ds="http://schemas.openxmlformats.org/officeDocument/2006/customXml" ds:itemID="{C363C405-5F69-494A-9EC9-42981894C99C}">
   <ds:schemaRefs>
-    <ds:schemaRef ds:uri="http://schemas.microsoft.com/office/2006/metadata/properties"/>
-    <ds:schemaRef ds:uri="http://schemas.microsoft.com/office/infopath/2007/PartnerControls"/>
+    <ds:schemaRef ds:uri="http://schemas.microsoft.com/sharepoint/v3/contenttype/forms"/>
   </ds:schemaRefs>
 </ds:datastoreItem>
 </file>
 
 <file path=customXml/itemProps2.xml><?xml version="1.0" encoding="utf-8"?>
-<ds:datastoreItem xmlns:ds="http://schemas.openxmlformats.org/officeDocument/2006/customXml" ds:itemID="{C363C405-5F69-494A-9EC9-42981894C99C}">
+<ds:datastoreItem xmlns:ds="http://schemas.openxmlformats.org/officeDocument/2006/customXml" ds:itemID="{0879AD43-6500-4156-A521-11C4987015EC}">
   <ds:schemaRefs>
-    <ds:schemaRef ds:uri="http://schemas.microsoft.com/sharepoint/v3/contenttype/forms"/>
+    <ds:schemaRef ds:uri="http://schemas.microsoft.com/office/2006/metadata/properties"/>
+    <ds:schemaRef ds:uri="http://schemas.microsoft.com/office/infopath/2007/PartnerControls"/>
   </ds:schemaRefs>
 </ds:datastoreItem>
 </file>

</xml_diff>

<commit_message>
Exercice sur les VLAN
</commit_message>
<xml_diff>
--- a/BASE_DE_DONNEES_RELATIONNELLE/Cours13/Cours13_Revision.docx
+++ b/BASE_DE_DONNEES_RELATIONNELLE/Cours13/Cours13_Revision.docx
@@ -176,7 +176,23 @@
           <w:rFonts w:ascii="Calibri" w:hAnsi="Calibri" w:cs="Calibri"/>
           <w:lang w:val="fr-FR"/>
         </w:rPr>
-        <w:t xml:space="preserve"> dans le Pokédex. Triez cette liste du plus grand au plus petit.</w:t>
+        <w:t xml:space="preserve"> dans le </w:t>
+      </w:r>
+      <w:proofErr w:type="spellStart"/>
+      <w:r>
+        <w:rPr>
+          <w:rFonts w:ascii="Calibri" w:hAnsi="Calibri" w:cs="Calibri"/>
+          <w:lang w:val="fr-FR"/>
+        </w:rPr>
+        <w:t>Pokédex</w:t>
+      </w:r>
+      <w:proofErr w:type="spellEnd"/>
+      <w:r>
+        <w:rPr>
+          <w:rFonts w:ascii="Calibri" w:hAnsi="Calibri" w:cs="Calibri"/>
+          <w:lang w:val="fr-FR"/>
+        </w:rPr>
+        <w:t>. Triez cette liste du plus grand au plus petit.</w:t>
       </w:r>
     </w:p>
     <w:p>
@@ -411,12 +427,21 @@
         </w:rPr>
         <w:t xml:space="preserve">Sortez la liste des lieux de rencontre dont les dresseurs ont capturé le plus des Pokémon dont le type de </w:t>
       </w:r>
-      <w:r>
-        <w:rPr>
-          <w:rFonts w:ascii="Calibri" w:hAnsi="Calibri" w:cs="Calibri"/>
-          <w:lang w:val="fr-FR"/>
-        </w:rPr>
-        <w:t xml:space="preserve">tera </w:t>
+      <w:proofErr w:type="spellStart"/>
+      <w:r>
+        <w:rPr>
+          <w:rFonts w:ascii="Calibri" w:hAnsi="Calibri" w:cs="Calibri"/>
+          <w:lang w:val="fr-FR"/>
+        </w:rPr>
+        <w:t>tera</w:t>
+      </w:r>
+      <w:proofErr w:type="spellEnd"/>
+      <w:r>
+        <w:rPr>
+          <w:rFonts w:ascii="Calibri" w:hAnsi="Calibri" w:cs="Calibri"/>
+          <w:lang w:val="fr-FR"/>
+        </w:rPr>
+        <w:t xml:space="preserve"> </w:t>
       </w:r>
       <w:r>
         <w:rPr>
@@ -437,7 +462,23 @@
           <w:rFonts w:ascii="Calibri" w:hAnsi="Calibri" w:cs="Calibri"/>
           <w:lang w:val="fr-FR"/>
         </w:rPr>
-        <w:t>(tera_type)</w:t>
+        <w:t>(</w:t>
+      </w:r>
+      <w:proofErr w:type="spellStart"/>
+      <w:r>
+        <w:rPr>
+          <w:rFonts w:ascii="Calibri" w:hAnsi="Calibri" w:cs="Calibri"/>
+          <w:lang w:val="fr-FR"/>
+        </w:rPr>
+        <w:t>tera_type</w:t>
+      </w:r>
+      <w:proofErr w:type="spellEnd"/>
+      <w:r>
+        <w:rPr>
+          <w:rFonts w:ascii="Calibri" w:hAnsi="Calibri" w:cs="Calibri"/>
+          <w:lang w:val="fr-FR"/>
+        </w:rPr>
+        <w:t>)</w:t>
       </w:r>
       <w:r>
         <w:rPr>
@@ -621,7 +662,23 @@
           <w:rFonts w:ascii="Calibri" w:hAnsi="Calibri" w:cs="Calibri"/>
           <w:lang w:val="fr-FR"/>
         </w:rPr>
-        <w:t>des Pokémon « shiny » qui date</w:t>
+        <w:t>des Pokémon « </w:t>
+      </w:r>
+      <w:proofErr w:type="spellStart"/>
+      <w:r>
+        <w:rPr>
+          <w:rFonts w:ascii="Calibri" w:hAnsi="Calibri" w:cs="Calibri"/>
+          <w:lang w:val="fr-FR"/>
+        </w:rPr>
+        <w:t>shiny</w:t>
+      </w:r>
+      <w:proofErr w:type="spellEnd"/>
+      <w:r>
+        <w:rPr>
+          <w:rFonts w:ascii="Calibri" w:hAnsi="Calibri" w:cs="Calibri"/>
+          <w:lang w:val="fr-FR"/>
+        </w:rPr>
+        <w:t> » qui date</w:t>
       </w:r>
       <w:r>
         <w:rPr>
@@ -708,8 +765,17 @@
           <w:rFonts w:ascii="Calibri" w:hAnsi="Calibri" w:cs="Calibri"/>
           <w:lang w:val="fr-FR"/>
         </w:rPr>
-        <w:t>Sortez la liste des 25 premier Pokémon du Pokédex</w:t>
-      </w:r>
+        <w:t xml:space="preserve">Sortez la liste des 25 premier Pokémon du </w:t>
+      </w:r>
+      <w:proofErr w:type="spellStart"/>
+      <w:r>
+        <w:rPr>
+          <w:rFonts w:ascii="Calibri" w:hAnsi="Calibri" w:cs="Calibri"/>
+          <w:lang w:val="fr-FR"/>
+        </w:rPr>
+        <w:t>Pokédex</w:t>
+      </w:r>
+      <w:proofErr w:type="spellEnd"/>
       <w:r>
         <w:rPr>
           <w:rFonts w:ascii="Calibri" w:hAnsi="Calibri" w:cs="Calibri"/>
@@ -867,7 +933,23 @@
           <w:rFonts w:ascii="Calibri" w:hAnsi="Calibri" w:cs="Calibri"/>
           <w:lang w:val="fr-FR"/>
         </w:rPr>
-        <w:t xml:space="preserve"> « shiny »</w:t>
+        <w:t xml:space="preserve"> « </w:t>
+      </w:r>
+      <w:proofErr w:type="spellStart"/>
+      <w:r>
+        <w:rPr>
+          <w:rFonts w:ascii="Calibri" w:hAnsi="Calibri" w:cs="Calibri"/>
+          <w:lang w:val="fr-FR"/>
+        </w:rPr>
+        <w:t>shiny</w:t>
+      </w:r>
+      <w:proofErr w:type="spellEnd"/>
+      <w:r>
+        <w:rPr>
+          <w:rFonts w:ascii="Calibri" w:hAnsi="Calibri" w:cs="Calibri"/>
+          <w:lang w:val="fr-FR"/>
+        </w:rPr>
+        <w:t> »</w:t>
       </w:r>
       <w:r>
         <w:rPr>
@@ -889,6 +971,7 @@
       <w:r>
         <w:rPr>
           <w:rFonts w:ascii="Calibri" w:hAnsi="Calibri" w:cs="Calibri"/>
+          <w:noProof/>
           <w:lang w:val="fr-FR"/>
         </w:rPr>
         <w:drawing>
@@ -946,7 +1029,23 @@
           <w:rFonts w:ascii="Calibri" w:hAnsi="Calibri" w:cs="Calibri"/>
           <w:lang w:val="fr-FR"/>
         </w:rPr>
-        <w:t xml:space="preserve">Dans le Pokédex, trouvez </w:t>
+        <w:t xml:space="preserve">Dans le </w:t>
+      </w:r>
+      <w:proofErr w:type="spellStart"/>
+      <w:r>
+        <w:rPr>
+          <w:rFonts w:ascii="Calibri" w:hAnsi="Calibri" w:cs="Calibri"/>
+          <w:lang w:val="fr-FR"/>
+        </w:rPr>
+        <w:t>Pokédex</w:t>
+      </w:r>
+      <w:proofErr w:type="spellEnd"/>
+      <w:r>
+        <w:rPr>
+          <w:rFonts w:ascii="Calibri" w:hAnsi="Calibri" w:cs="Calibri"/>
+          <w:lang w:val="fr-FR"/>
+        </w:rPr>
+        <w:t xml:space="preserve">, trouvez </w:t>
       </w:r>
       <w:r>
         <w:rPr>
@@ -960,7 +1059,23 @@
           <w:rFonts w:ascii="Calibri" w:hAnsi="Calibri" w:cs="Calibri"/>
           <w:lang w:val="fr-FR"/>
         </w:rPr>
-        <w:t>, n’oubliez pas de renommer les colonnes, les 18 hahaha.</w:t>
+        <w:t xml:space="preserve">, n’oubliez pas de renommer les colonnes, les 18 </w:t>
+      </w:r>
+      <w:proofErr w:type="spellStart"/>
+      <w:r>
+        <w:rPr>
+          <w:rFonts w:ascii="Calibri" w:hAnsi="Calibri" w:cs="Calibri"/>
+          <w:lang w:val="fr-FR"/>
+        </w:rPr>
+        <w:t>hahaha</w:t>
+      </w:r>
+      <w:proofErr w:type="spellEnd"/>
+      <w:r>
+        <w:rPr>
+          <w:rFonts w:ascii="Calibri" w:hAnsi="Calibri" w:cs="Calibri"/>
+          <w:lang w:val="fr-FR"/>
+        </w:rPr>
+        <w:t>.</w:t>
       </w:r>
     </w:p>
     <w:p>
@@ -1025,7 +1140,23 @@
           <w:rFonts w:ascii="Calibri" w:hAnsi="Calibri" w:cs="Calibri"/>
           <w:lang w:val="fr-FR"/>
         </w:rPr>
-        <w:t>Pokémon dans le Pokédex qui</w:t>
+        <w:t xml:space="preserve">Pokémon dans le </w:t>
+      </w:r>
+      <w:proofErr w:type="spellStart"/>
+      <w:r>
+        <w:rPr>
+          <w:rFonts w:ascii="Calibri" w:hAnsi="Calibri" w:cs="Calibri"/>
+          <w:lang w:val="fr-FR"/>
+        </w:rPr>
+        <w:t>Pokédex</w:t>
+      </w:r>
+      <w:proofErr w:type="spellEnd"/>
+      <w:r>
+        <w:rPr>
+          <w:rFonts w:ascii="Calibri" w:hAnsi="Calibri" w:cs="Calibri"/>
+          <w:lang w:val="fr-FR"/>
+        </w:rPr>
+        <w:t xml:space="preserve"> qui</w:t>
       </w:r>
       <w:r>
         <w:rPr>
@@ -1123,14 +1254,78 @@
           <w:rFonts w:ascii="Calibri" w:hAnsi="Calibri" w:cs="Calibri"/>
           <w:lang w:val="fr-FR"/>
         </w:rPr>
-        <w:t xml:space="preserve">On cherche pour une équipe compétitive des Pokémon (du Pokédex) qui sont rapides et robustes pour une équipe </w:t>
-      </w:r>
-      <w:r>
-        <w:rPr>
-          <w:rFonts w:ascii="Calibri" w:hAnsi="Calibri" w:cs="Calibri"/>
-          <w:lang w:val="fr-FR"/>
-        </w:rPr>
-        <w:t xml:space="preserve">de style « Bulky Offense ». Voici les pré-requis, la vitesse de base doit être supérieure à 90, les pv doivent être supérieurs à 90, le type 1 doit être </w:t>
+        <w:t xml:space="preserve">On cherche pour une équipe compétitive des Pokémon (du </w:t>
+      </w:r>
+      <w:proofErr w:type="spellStart"/>
+      <w:r>
+        <w:rPr>
+          <w:rFonts w:ascii="Calibri" w:hAnsi="Calibri" w:cs="Calibri"/>
+          <w:lang w:val="fr-FR"/>
+        </w:rPr>
+        <w:t>Pokédex</w:t>
+      </w:r>
+      <w:proofErr w:type="spellEnd"/>
+      <w:r>
+        <w:rPr>
+          <w:rFonts w:ascii="Calibri" w:hAnsi="Calibri" w:cs="Calibri"/>
+          <w:lang w:val="fr-FR"/>
+        </w:rPr>
+        <w:t xml:space="preserve">) qui sont rapides et robustes pour une équipe </w:t>
+      </w:r>
+      <w:r>
+        <w:rPr>
+          <w:rFonts w:ascii="Calibri" w:hAnsi="Calibri" w:cs="Calibri"/>
+          <w:lang w:val="fr-FR"/>
+        </w:rPr>
+        <w:t>de style « </w:t>
+      </w:r>
+      <w:proofErr w:type="spellStart"/>
+      <w:r>
+        <w:rPr>
+          <w:rFonts w:ascii="Calibri" w:hAnsi="Calibri" w:cs="Calibri"/>
+          <w:lang w:val="fr-FR"/>
+        </w:rPr>
+        <w:t>Bulky</w:t>
+      </w:r>
+      <w:proofErr w:type="spellEnd"/>
+      <w:r>
+        <w:rPr>
+          <w:rFonts w:ascii="Calibri" w:hAnsi="Calibri" w:cs="Calibri"/>
+          <w:lang w:val="fr-FR"/>
+        </w:rPr>
+        <w:t xml:space="preserve"> Offense ». Voici les </w:t>
+      </w:r>
+      <w:proofErr w:type="spellStart"/>
+      <w:r>
+        <w:rPr>
+          <w:rFonts w:ascii="Calibri" w:hAnsi="Calibri" w:cs="Calibri"/>
+          <w:lang w:val="fr-FR"/>
+        </w:rPr>
+        <w:t>pré-requis</w:t>
+      </w:r>
+      <w:proofErr w:type="spellEnd"/>
+      <w:r>
+        <w:rPr>
+          <w:rFonts w:ascii="Calibri" w:hAnsi="Calibri" w:cs="Calibri"/>
+          <w:lang w:val="fr-FR"/>
+        </w:rPr>
+        <w:t xml:space="preserve">, la vitesse de base doit être supérieure à 90, les </w:t>
+      </w:r>
+      <w:proofErr w:type="spellStart"/>
+      <w:r>
+        <w:rPr>
+          <w:rFonts w:ascii="Calibri" w:hAnsi="Calibri" w:cs="Calibri"/>
+          <w:lang w:val="fr-FR"/>
+        </w:rPr>
+        <w:t>pv</w:t>
+      </w:r>
+      <w:proofErr w:type="spellEnd"/>
+      <w:r>
+        <w:rPr>
+          <w:rFonts w:ascii="Calibri" w:hAnsi="Calibri" w:cs="Calibri"/>
+          <w:lang w:val="fr-FR"/>
+        </w:rPr>
+        <w:t xml:space="preserve"> doivent être supérieurs à 90, le type 1 doit être </w:t>
       </w:r>
       <w:r>
         <w:rPr>
@@ -1139,6 +1334,7 @@
         </w:rPr>
         <w:t>« </w:t>
       </w:r>
+      <w:proofErr w:type="spellStart"/>
       <w:r>
         <w:rPr>
           <w:rFonts w:ascii="Calibri" w:hAnsi="Calibri" w:cs="Calibri"/>
@@ -1146,12 +1342,29 @@
         </w:rPr>
         <w:t>électrik</w:t>
       </w:r>
-      <w:r>
-        <w:rPr>
-          <w:rFonts w:ascii="Calibri" w:hAnsi="Calibri" w:cs="Calibri"/>
-          <w:lang w:val="fr-FR"/>
-        </w:rPr>
-        <w:t xml:space="preserve"> » ou « eau » et le numéro dans le Pokédex doit être </w:t>
+      <w:proofErr w:type="spellEnd"/>
+      <w:r>
+        <w:rPr>
+          <w:rFonts w:ascii="Calibri" w:hAnsi="Calibri" w:cs="Calibri"/>
+          <w:lang w:val="fr-FR"/>
+        </w:rPr>
+        <w:t xml:space="preserve"> » ou « eau » et le numéro dans le </w:t>
+      </w:r>
+      <w:proofErr w:type="spellStart"/>
+      <w:r>
+        <w:rPr>
+          <w:rFonts w:ascii="Calibri" w:hAnsi="Calibri" w:cs="Calibri"/>
+          <w:lang w:val="fr-FR"/>
+        </w:rPr>
+        <w:t>Pokédex</w:t>
+      </w:r>
+      <w:proofErr w:type="spellEnd"/>
+      <w:r>
+        <w:rPr>
+          <w:rFonts w:ascii="Calibri" w:hAnsi="Calibri" w:cs="Calibri"/>
+          <w:lang w:val="fr-FR"/>
+        </w:rPr>
+        <w:t xml:space="preserve"> doit être </w:t>
       </w:r>
       <w:r>
         <w:rPr>
@@ -1179,7 +1392,23 @@
           <w:rFonts w:ascii="Calibri" w:hAnsi="Calibri" w:cs="Calibri"/>
           <w:lang w:val="fr-FR"/>
         </w:rPr>
-        <w:t>Vendredi prochain c’est ENCORE un vendredi 13. Such wow, Much incredible !</w:t>
+        <w:t xml:space="preserve">Vendredi prochain c’est ENCORE un vendredi 13. Such wow, Much </w:t>
+      </w:r>
+      <w:proofErr w:type="spellStart"/>
+      <w:r>
+        <w:rPr>
+          <w:rFonts w:ascii="Calibri" w:hAnsi="Calibri" w:cs="Calibri"/>
+          <w:lang w:val="fr-FR"/>
+        </w:rPr>
+        <w:t>incredible</w:t>
+      </w:r>
+      <w:proofErr w:type="spellEnd"/>
+      <w:r>
+        <w:rPr>
+          <w:rFonts w:ascii="Calibri" w:hAnsi="Calibri" w:cs="Calibri"/>
+          <w:lang w:val="fr-FR"/>
+        </w:rPr>
+        <w:t> !</w:t>
       </w:r>
     </w:p>
     <w:p>
@@ -1200,14 +1429,39 @@
           <w:rFonts w:ascii="Calibri" w:hAnsi="Calibri" w:cs="Calibri"/>
           <w:lang w:val="fr-FR"/>
         </w:rPr>
-        <w:t>Pour notre équipe ultra offensive, on veut les Pokémon du Pokédex</w:t>
-      </w:r>
-      <w:r>
-        <w:rPr>
-          <w:rFonts w:ascii="Calibri" w:hAnsi="Calibri" w:cs="Calibri"/>
-          <w:lang w:val="fr-FR"/>
-        </w:rPr>
-        <w:t xml:space="preserve"> qui sont de ce que l’on nomme en anglais « glass cannon ».</w:t>
+        <w:t xml:space="preserve">Pour notre équipe ultra offensive, on veut les Pokémon du </w:t>
+      </w:r>
+      <w:proofErr w:type="spellStart"/>
+      <w:r>
+        <w:rPr>
+          <w:rFonts w:ascii="Calibri" w:hAnsi="Calibri" w:cs="Calibri"/>
+          <w:lang w:val="fr-FR"/>
+        </w:rPr>
+        <w:t>Pokédex</w:t>
+      </w:r>
+      <w:proofErr w:type="spellEnd"/>
+      <w:r>
+        <w:rPr>
+          <w:rFonts w:ascii="Calibri" w:hAnsi="Calibri" w:cs="Calibri"/>
+          <w:lang w:val="fr-FR"/>
+        </w:rPr>
+        <w:t xml:space="preserve"> qui sont de ce que l’on nomme en anglais « glass </w:t>
+      </w:r>
+      <w:proofErr w:type="spellStart"/>
+      <w:r>
+        <w:rPr>
+          <w:rFonts w:ascii="Calibri" w:hAnsi="Calibri" w:cs="Calibri"/>
+          <w:lang w:val="fr-FR"/>
+        </w:rPr>
+        <w:t>cannon</w:t>
+      </w:r>
+      <w:proofErr w:type="spellEnd"/>
+      <w:r>
+        <w:rPr>
+          <w:rFonts w:ascii="Calibri" w:hAnsi="Calibri" w:cs="Calibri"/>
+          <w:lang w:val="fr-FR"/>
+        </w:rPr>
+        <w:t> ».</w:t>
       </w:r>
       <w:r>
         <w:rPr>
@@ -1221,14 +1475,46 @@
           <w:rFonts w:ascii="Calibri" w:hAnsi="Calibri" w:cs="Calibri"/>
           <w:lang w:val="fr-FR"/>
         </w:rPr>
-        <w:t>spéciale (atq_spe) est supérieur à 110. La défense ou la</w:t>
-      </w:r>
-      <w:r>
-        <w:rPr>
-          <w:rFonts w:ascii="Calibri" w:hAnsi="Calibri" w:cs="Calibri"/>
-          <w:lang w:val="fr-FR"/>
-        </w:rPr>
-        <w:t xml:space="preserve"> défense spéciale (def_spe) doit être inférieure à 50. Le type_2 ne doit pas être NULL et le nom de l’espèce doit être plus long que 5 caractères !</w:t>
+        <w:t>spéciale (</w:t>
+      </w:r>
+      <w:proofErr w:type="spellStart"/>
+      <w:r>
+        <w:rPr>
+          <w:rFonts w:ascii="Calibri" w:hAnsi="Calibri" w:cs="Calibri"/>
+          <w:lang w:val="fr-FR"/>
+        </w:rPr>
+        <w:t>atq_spe</w:t>
+      </w:r>
+      <w:proofErr w:type="spellEnd"/>
+      <w:r>
+        <w:rPr>
+          <w:rFonts w:ascii="Calibri" w:hAnsi="Calibri" w:cs="Calibri"/>
+          <w:lang w:val="fr-FR"/>
+        </w:rPr>
+        <w:t>) est supérieur à 110. La défense ou la</w:t>
+      </w:r>
+      <w:r>
+        <w:rPr>
+          <w:rFonts w:ascii="Calibri" w:hAnsi="Calibri" w:cs="Calibri"/>
+          <w:lang w:val="fr-FR"/>
+        </w:rPr>
+        <w:t xml:space="preserve"> défense spéciale (</w:t>
+      </w:r>
+      <w:proofErr w:type="spellStart"/>
+      <w:r>
+        <w:rPr>
+          <w:rFonts w:ascii="Calibri" w:hAnsi="Calibri" w:cs="Calibri"/>
+          <w:lang w:val="fr-FR"/>
+        </w:rPr>
+        <w:t>def_spe</w:t>
+      </w:r>
+      <w:proofErr w:type="spellEnd"/>
+      <w:r>
+        <w:rPr>
+          <w:rFonts w:ascii="Calibri" w:hAnsi="Calibri" w:cs="Calibri"/>
+          <w:lang w:val="fr-FR"/>
+        </w:rPr>
+        <w:t>) doit être inférieure à 50. Le type_2 ne doit pas être NULL et le nom de l’espèce doit être plus long que 5 caractères !</w:t>
       </w:r>
     </w:p>
     <w:p>
@@ -3449,18 +3735,18 @@
 </file>
 
 <file path=customXml/item1.xml><?xml version="1.0" encoding="utf-8"?>
+<p:properties xmlns:p="http://schemas.microsoft.com/office/2006/metadata/properties" xmlns:xsi="http://www.w3.org/2001/XMLSchema-instance" xmlns:pc="http://schemas.microsoft.com/office/infopath/2007/PartnerControls">
+  <documentManagement/>
+</p:properties>
+</file>
+
+<file path=customXml/item2.xml><?xml version="1.0" encoding="utf-8"?>
 <?mso-contentType ?>
 <FormTemplates xmlns="http://schemas.microsoft.com/sharepoint/v3/contenttype/forms">
   <Display>DocumentLibraryForm</Display>
   <Edit>DocumentLibraryForm</Edit>
   <New>DocumentLibraryForm</New>
 </FormTemplates>
-</file>
-
-<file path=customXml/item2.xml><?xml version="1.0" encoding="utf-8"?>
-<p:properties xmlns:p="http://schemas.microsoft.com/office/2006/metadata/properties" xmlns:xsi="http://www.w3.org/2001/XMLSchema-instance" xmlns:pc="http://schemas.microsoft.com/office/infopath/2007/PartnerControls">
-  <documentManagement/>
-</p:properties>
 </file>
 
 <file path=customXml/item3.xml><?xml version="1.0" encoding="utf-8"?>
@@ -3602,18 +3888,18 @@
 </file>
 
 <file path=customXml/itemProps1.xml><?xml version="1.0" encoding="utf-8"?>
-<ds:datastoreItem xmlns:ds="http://schemas.openxmlformats.org/officeDocument/2006/customXml" ds:itemID="{C363C405-5F69-494A-9EC9-42981894C99C}">
+<ds:datastoreItem xmlns:ds="http://schemas.openxmlformats.org/officeDocument/2006/customXml" ds:itemID="{0879AD43-6500-4156-A521-11C4987015EC}">
   <ds:schemaRefs>
-    <ds:schemaRef ds:uri="http://schemas.microsoft.com/sharepoint/v3/contenttype/forms"/>
+    <ds:schemaRef ds:uri="http://schemas.microsoft.com/office/2006/metadata/properties"/>
+    <ds:schemaRef ds:uri="http://schemas.microsoft.com/office/infopath/2007/PartnerControls"/>
   </ds:schemaRefs>
 </ds:datastoreItem>
 </file>
 
 <file path=customXml/itemProps2.xml><?xml version="1.0" encoding="utf-8"?>
-<ds:datastoreItem xmlns:ds="http://schemas.openxmlformats.org/officeDocument/2006/customXml" ds:itemID="{0879AD43-6500-4156-A521-11C4987015EC}">
+<ds:datastoreItem xmlns:ds="http://schemas.openxmlformats.org/officeDocument/2006/customXml" ds:itemID="{C363C405-5F69-494A-9EC9-42981894C99C}">
   <ds:schemaRefs>
-    <ds:schemaRef ds:uri="http://schemas.microsoft.com/office/2006/metadata/properties"/>
-    <ds:schemaRef ds:uri="http://schemas.microsoft.com/office/infopath/2007/PartnerControls"/>
+    <ds:schemaRef ds:uri="http://schemas.microsoft.com/sharepoint/v3/contenttype/forms"/>
   </ds:schemaRefs>
 </ds:datastoreItem>
 </file>

</xml_diff>